<commit_message>
ADDING TODAY'S WORK - 08.05.2026
</commit_message>
<xml_diff>
--- a/01_Protease/docs/plans/L4137_project_structure.docx
+++ b/01_Protease/docs/plans/L4137_project_structure.docx
@@ -9,6 +9,7 @@
           <w:bCs/>
         </w:rPr>
       </w:pPr>
+      <w:proofErr w:type="spellStart"/>
       <w:r>
         <w:rPr>
           <w:b/>
@@ -16,6 +17,7 @@
         </w:rPr>
         <w:t>Gitignore</w:t>
       </w:r>
+      <w:proofErr w:type="spellEnd"/>
     </w:p>
     <w:p>
       <w:pPr>
@@ -86,8 +88,21 @@
         </w:numPr>
       </w:pPr>
       <w:r>
-        <w:t>README.md inside script folders should have the ‘command description’ section read like a story – explanation of why I’m doing each step as well as what it’s doing. This will make it readable for people unfamiliar with the project and also non-bioinformaticicans</w:t>
-      </w:r>
+        <w:t xml:space="preserve">README.md inside script folders should have the ‘command description’ section read like a story – explanation of why I’m doing each step as well as what it’s doing. This will make it readable for people unfamiliar with the project </w:t>
+      </w:r>
+      <w:proofErr w:type="gramStart"/>
+      <w:r>
+        <w:t>and also</w:t>
+      </w:r>
+      <w:proofErr w:type="gramEnd"/>
+      <w:r>
+        <w:t xml:space="preserve"> non-</w:t>
+      </w:r>
+      <w:proofErr w:type="spellStart"/>
+      <w:r>
+        <w:t>bioinformaticicans</w:t>
+      </w:r>
+      <w:proofErr w:type="spellEnd"/>
     </w:p>
     <w:p>
       <w:pPr>
@@ -120,6 +135,18 @@
       <w:pPr>
         <w:pStyle w:val="ListParagraph"/>
         <w:numPr>
+          <w:ilvl w:val="1"/>
+          <w:numId w:val="4"/>
+        </w:numPr>
+      </w:pPr>
+      <w:r>
+        <w:t>Set log file as an argument?</w:t>
+      </w:r>
+    </w:p>
+    <w:p>
+      <w:pPr>
+        <w:pStyle w:val="ListParagraph"/>
+        <w:numPr>
           <w:ilvl w:val="0"/>
           <w:numId w:val="4"/>
         </w:numPr>
@@ -148,8 +175,13 @@
           <w:numId w:val="4"/>
         </w:numPr>
       </w:pPr>
-      <w:r>
-        <w:t>Colums: script, description of quality filter, default</w:t>
+      <w:proofErr w:type="spellStart"/>
+      <w:r>
+        <w:t>Colums</w:t>
+      </w:r>
+      <w:proofErr w:type="spellEnd"/>
+      <w:r>
+        <w:t>: script, description of quality filter, default</w:t>
       </w:r>
     </w:p>
     <w:p>
@@ -181,7 +213,23 @@
         <w:pStyle w:val="ListParagraph"/>
       </w:pPr>
       <w:r>
-        <w:t>Default values are set before the “while getopts…” code chunk, these are only overrided if the user provides a flag</w:t>
+        <w:t xml:space="preserve">Default values are set before the “while </w:t>
+      </w:r>
+      <w:proofErr w:type="spellStart"/>
+      <w:r>
+        <w:t>getopts</w:t>
+      </w:r>
+      <w:proofErr w:type="spellEnd"/>
+      <w:r>
+        <w:t xml:space="preserve">…” code chunk, these are only </w:t>
+      </w:r>
+      <w:proofErr w:type="spellStart"/>
+      <w:r>
+        <w:t>overrided</w:t>
+      </w:r>
+      <w:proofErr w:type="spellEnd"/>
+      <w:r>
+        <w:t xml:space="preserve"> if the user provides a flag</w:t>
       </w:r>
       <w:r>
         <w:rPr>
@@ -317,6 +365,65 @@
           <w:numId w:val="3"/>
         </w:numPr>
       </w:pPr>
+      <w:r>
+        <w:t>End-of-project bonus:</w:t>
+      </w:r>
+    </w:p>
+    <w:p>
+      <w:pPr>
+        <w:pStyle w:val="ListParagraph"/>
+        <w:numPr>
+          <w:ilvl w:val="1"/>
+          <w:numId w:val="3"/>
+        </w:numPr>
+      </w:pPr>
+      <w:r>
+        <w:t xml:space="preserve">GUI with buttons that contain hyperlinks to results (e.g. figures) from different permutations of quality filters </w:t>
+      </w:r>
+    </w:p>
+    <w:p>
+      <w:pPr>
+        <w:pStyle w:val="ListParagraph"/>
+        <w:numPr>
+          <w:ilvl w:val="1"/>
+          <w:numId w:val="3"/>
+        </w:numPr>
+      </w:pPr>
+      <w:r>
+        <w:t>This will enable easy exploratory analysis</w:t>
+      </w:r>
+    </w:p>
+    <w:p>
+      <w:pPr>
+        <w:pStyle w:val="ListParagraph"/>
+        <w:numPr>
+          <w:ilvl w:val="1"/>
+          <w:numId w:val="3"/>
+        </w:numPr>
+      </w:pPr>
+      <w:r>
+        <w:t xml:space="preserve">If the user-defined filters are set to a .txt </w:t>
+      </w:r>
+      <w:proofErr w:type="gramStart"/>
+      <w:r>
+        <w:t>file</w:t>
+      </w:r>
+      <w:proofErr w:type="gramEnd"/>
+      <w:r>
+        <w:t xml:space="preserve"> then can make a bunch of different files with different parameters to get lots of figures quickly</w:t>
+      </w:r>
+    </w:p>
+    <w:p>
+      <w:pPr>
+        <w:pStyle w:val="ListParagraph"/>
+        <w:numPr>
+          <w:ilvl w:val="0"/>
+          <w:numId w:val="3"/>
+        </w:numPr>
+      </w:pPr>
+      <w:r>
+        <w:t>Verify outputs exist and are none-empty at the end of each script?</w:t>
+      </w:r>
     </w:p>
     <w:p>
       <w:r>
@@ -425,9 +532,11 @@
           <w:numId w:val="1"/>
         </w:numPr>
       </w:pPr>
+      <w:proofErr w:type="spellStart"/>
       <w:r>
         <w:t>fastqc</w:t>
       </w:r>
+      <w:proofErr w:type="spellEnd"/>
     </w:p>
     <w:p>
       <w:pPr>
@@ -498,6 +607,7 @@
         </w:numPr>
       </w:pPr>
       <w:r>
+        <w:lastRenderedPageBreak/>
         <w:t>Installation.md</w:t>
       </w:r>
     </w:p>
@@ -871,7 +981,7 @@
         <w:rFonts w:ascii="Symbol" w:hAnsi="Symbol" w:hint="default"/>
       </w:rPr>
     </w:lvl>
-    <w:lvl w:ilvl="1" w:tplc="08090003" w:tentative="1">
+    <w:lvl w:ilvl="1" w:tplc="08090003">
       <w:start w:val="1"/>
       <w:numFmt w:val="bullet"/>
       <w:lvlText w:val="o"/>

</xml_diff>

<commit_message>
ADDING TODAY'S WORK - 11.05.2026
</commit_message>
<xml_diff>
--- a/01_Protease/docs/plans/L4137_project_structure.docx
+++ b/01_Protease/docs/plans/L4137_project_structure.docx
@@ -362,6 +362,42 @@
         <w:pStyle w:val="ListParagraph"/>
         <w:numPr>
           <w:ilvl w:val="0"/>
+          <w:numId w:val="4"/>
+        </w:numPr>
+      </w:pPr>
+      <w:r>
+        <w:t>The user-defined input bit could be a test file that they edit (ensure each line to edit is commented clearly)</w:t>
+      </w:r>
+    </w:p>
+    <w:p>
+      <w:pPr>
+        <w:pStyle w:val="ListParagraph"/>
+        <w:numPr>
+          <w:ilvl w:val="1"/>
+          <w:numId w:val="4"/>
+        </w:numPr>
+      </w:pPr>
+      <w:r>
+        <w:t>E.g. use nano to open, then edit each line as appropriate</w:t>
+      </w:r>
+    </w:p>
+    <w:p>
+      <w:pPr>
+        <w:pStyle w:val="ListParagraph"/>
+        <w:numPr>
+          <w:ilvl w:val="1"/>
+          <w:numId w:val="4"/>
+        </w:numPr>
+      </w:pPr>
+      <w:r>
+        <w:t>Then could create functions to extract the appropriate filter (with specific names) and this could be used to integrate the scripts with the pipeline script</w:t>
+      </w:r>
+    </w:p>
+    <w:p>
+      <w:pPr>
+        <w:pStyle w:val="ListParagraph"/>
+        <w:numPr>
+          <w:ilvl w:val="0"/>
           <w:numId w:val="3"/>
         </w:numPr>
       </w:pPr>
@@ -423,6 +459,18 @@
       </w:pPr>
       <w:r>
         <w:t>Verify outputs exist and are none-empty at the end of each script?</w:t>
+      </w:r>
+    </w:p>
+    <w:p>
+      <w:pPr>
+        <w:pStyle w:val="ListParagraph"/>
+        <w:numPr>
+          <w:ilvl w:val="0"/>
+          <w:numId w:val="3"/>
+        </w:numPr>
+      </w:pPr>
+      <w:r>
+        <w:t>Copy reports to dedicated ‘reports’ directory at the end of a relevant script – this keeps the original for traceability</w:t>
       </w:r>
     </w:p>
     <w:p>
@@ -458,6 +506,54 @@
         </w:numPr>
       </w:pPr>
       <w:r>
+        <w:t>data</w:t>
+      </w:r>
+    </w:p>
+    <w:p>
+      <w:pPr>
+        <w:pStyle w:val="ListParagraph"/>
+        <w:numPr>
+          <w:ilvl w:val="2"/>
+          <w:numId w:val="1"/>
+        </w:numPr>
+      </w:pPr>
+      <w:r>
+        <w:t>raw</w:t>
+      </w:r>
+    </w:p>
+    <w:p>
+      <w:pPr>
+        <w:pStyle w:val="ListParagraph"/>
+        <w:numPr>
+          <w:ilvl w:val="2"/>
+          <w:numId w:val="1"/>
+        </w:numPr>
+      </w:pPr>
+      <w:r>
+        <w:t>processed</w:t>
+      </w:r>
+    </w:p>
+    <w:p>
+      <w:pPr>
+        <w:pStyle w:val="ListParagraph"/>
+        <w:numPr>
+          <w:ilvl w:val="2"/>
+          <w:numId w:val="1"/>
+        </w:numPr>
+      </w:pPr>
+      <w:r>
+        <w:t>reference</w:t>
+      </w:r>
+    </w:p>
+    <w:p>
+      <w:pPr>
+        <w:pStyle w:val="ListParagraph"/>
+        <w:numPr>
+          <w:ilvl w:val="1"/>
+          <w:numId w:val="1"/>
+        </w:numPr>
+      </w:pPr>
+      <w:r>
         <w:t>s</w:t>
       </w:r>
       <w:r>
@@ -468,12 +564,73 @@
       <w:pPr>
         <w:pStyle w:val="ListParagraph"/>
         <w:numPr>
+          <w:ilvl w:val="2"/>
+          <w:numId w:val="1"/>
+        </w:numPr>
+      </w:pPr>
+      <w:r>
+        <w:lastRenderedPageBreak/>
+        <w:t>01_data_preparation</w:t>
+      </w:r>
+    </w:p>
+    <w:p>
+      <w:pPr>
+        <w:pStyle w:val="ListParagraph"/>
+        <w:numPr>
+          <w:ilvl w:val="2"/>
+          <w:numId w:val="1"/>
+        </w:numPr>
+      </w:pPr>
+      <w:r>
+        <w:t>02_quality_control</w:t>
+      </w:r>
+    </w:p>
+    <w:p>
+      <w:pPr>
+        <w:pStyle w:val="ListParagraph"/>
+        <w:numPr>
+          <w:ilvl w:val="3"/>
+          <w:numId w:val="1"/>
+        </w:numPr>
+      </w:pPr>
+      <w:r>
+        <w:t>02a_raw_reads_qc</w:t>
+      </w:r>
+    </w:p>
+    <w:p>
+      <w:pPr>
+        <w:pStyle w:val="ListParagraph"/>
+        <w:numPr>
+          <w:ilvl w:val="3"/>
+          <w:numId w:val="1"/>
+        </w:numPr>
+      </w:pPr>
+      <w:r>
+        <w:t>02b_trimming</w:t>
+      </w:r>
+    </w:p>
+    <w:p>
+      <w:pPr>
+        <w:pStyle w:val="ListParagraph"/>
+        <w:numPr>
+          <w:ilvl w:val="3"/>
+          <w:numId w:val="1"/>
+        </w:numPr>
+      </w:pPr>
+      <w:r>
+        <w:t>02c_trimmed_reads_qc</w:t>
+      </w:r>
+    </w:p>
+    <w:p>
+      <w:pPr>
+        <w:pStyle w:val="ListParagraph"/>
+        <w:numPr>
           <w:ilvl w:val="1"/>
           <w:numId w:val="1"/>
         </w:numPr>
       </w:pPr>
       <w:r>
-        <w:t>data</w:t>
+        <w:t>results</w:t>
       </w:r>
     </w:p>
     <w:p>
@@ -485,7 +642,7 @@
         </w:numPr>
       </w:pPr>
       <w:r>
-        <w:t>processed</w:t>
+        <w:t>reports</w:t>
       </w:r>
     </w:p>
     <w:p>
@@ -497,7 +654,213 @@
         </w:numPr>
       </w:pPr>
       <w:r>
-        <w:t>reference</w:t>
+        <w:t>tables</w:t>
+      </w:r>
+    </w:p>
+    <w:p>
+      <w:pPr>
+        <w:pStyle w:val="ListParagraph"/>
+        <w:numPr>
+          <w:ilvl w:val="2"/>
+          <w:numId w:val="1"/>
+        </w:numPr>
+      </w:pPr>
+      <w:r>
+        <w:t>figures</w:t>
+      </w:r>
+    </w:p>
+    <w:p>
+      <w:pPr>
+        <w:pStyle w:val="ListParagraph"/>
+        <w:numPr>
+          <w:ilvl w:val="2"/>
+          <w:numId w:val="1"/>
+        </w:numPr>
+      </w:pPr>
+      <w:proofErr w:type="spellStart"/>
+      <w:r>
+        <w:t>methods_sections</w:t>
+      </w:r>
+      <w:proofErr w:type="spellEnd"/>
+    </w:p>
+    <w:p>
+      <w:pPr>
+        <w:pStyle w:val="ListParagraph"/>
+        <w:numPr>
+          <w:ilvl w:val="3"/>
+          <w:numId w:val="1"/>
+        </w:numPr>
+      </w:pPr>
+      <w:r>
+        <w:t>02_quality_control</w:t>
+      </w:r>
+    </w:p>
+    <w:p>
+      <w:pPr>
+        <w:pStyle w:val="ListParagraph"/>
+        <w:numPr>
+          <w:ilvl w:val="4"/>
+          <w:numId w:val="1"/>
+        </w:numPr>
+      </w:pPr>
+      <w:r>
+        <w:t>02a_raw_reads_qc</w:t>
+      </w:r>
+    </w:p>
+    <w:p>
+      <w:pPr>
+        <w:pStyle w:val="ListParagraph"/>
+        <w:numPr>
+          <w:ilvl w:val="5"/>
+          <w:numId w:val="1"/>
+        </w:numPr>
+      </w:pPr>
+      <w:proofErr w:type="spellStart"/>
+      <w:r>
+        <w:t>fastqc</w:t>
+      </w:r>
+      <w:proofErr w:type="spellEnd"/>
+    </w:p>
+    <w:p>
+      <w:pPr>
+        <w:pStyle w:val="ListParagraph"/>
+        <w:numPr>
+          <w:ilvl w:val="5"/>
+          <w:numId w:val="1"/>
+        </w:numPr>
+      </w:pPr>
+      <w:proofErr w:type="spellStart"/>
+      <w:r>
+        <w:t>mirtrace</w:t>
+      </w:r>
+      <w:proofErr w:type="spellEnd"/>
+    </w:p>
+    <w:p>
+      <w:pPr>
+        <w:pStyle w:val="ListParagraph"/>
+        <w:numPr>
+          <w:ilvl w:val="6"/>
+          <w:numId w:val="1"/>
+        </w:numPr>
+      </w:pPr>
+      <w:r>
+        <w:t>qc</w:t>
+      </w:r>
+    </w:p>
+    <w:p>
+      <w:pPr>
+        <w:pStyle w:val="ListParagraph"/>
+        <w:numPr>
+          <w:ilvl w:val="6"/>
+          <w:numId w:val="1"/>
+        </w:numPr>
+      </w:pPr>
+      <w:r>
+        <w:t>trace</w:t>
+      </w:r>
+    </w:p>
+    <w:p>
+      <w:pPr>
+        <w:pStyle w:val="ListParagraph"/>
+        <w:numPr>
+          <w:ilvl w:val="4"/>
+          <w:numId w:val="1"/>
+        </w:numPr>
+      </w:pPr>
+      <w:r>
+        <w:t>02b_trimming</w:t>
+      </w:r>
+    </w:p>
+    <w:p>
+      <w:pPr>
+        <w:pStyle w:val="ListParagraph"/>
+        <w:numPr>
+          <w:ilvl w:val="5"/>
+          <w:numId w:val="1"/>
+        </w:numPr>
+      </w:pPr>
+      <w:proofErr w:type="spellStart"/>
+      <w:r>
+        <w:t>cutadapt</w:t>
+      </w:r>
+      <w:proofErr w:type="spellEnd"/>
+    </w:p>
+    <w:p>
+      <w:pPr>
+        <w:pStyle w:val="ListParagraph"/>
+        <w:numPr>
+          <w:ilvl w:val="5"/>
+          <w:numId w:val="1"/>
+        </w:numPr>
+      </w:pPr>
+      <w:proofErr w:type="spellStart"/>
+      <w:r>
+        <w:t>fastp</w:t>
+      </w:r>
+      <w:proofErr w:type="spellEnd"/>
+    </w:p>
+    <w:p>
+      <w:pPr>
+        <w:pStyle w:val="ListParagraph"/>
+        <w:numPr>
+          <w:ilvl w:val="4"/>
+          <w:numId w:val="1"/>
+        </w:numPr>
+      </w:pPr>
+      <w:r>
+        <w:t>02c_trimmed_reads_qc</w:t>
+      </w:r>
+    </w:p>
+    <w:p>
+      <w:pPr>
+        <w:pStyle w:val="ListParagraph"/>
+        <w:numPr>
+          <w:ilvl w:val="5"/>
+          <w:numId w:val="1"/>
+        </w:numPr>
+      </w:pPr>
+      <w:proofErr w:type="spellStart"/>
+      <w:r>
+        <w:t>fastqc</w:t>
+      </w:r>
+      <w:proofErr w:type="spellEnd"/>
+    </w:p>
+    <w:p>
+      <w:pPr>
+        <w:pStyle w:val="ListParagraph"/>
+        <w:numPr>
+          <w:ilvl w:val="5"/>
+          <w:numId w:val="1"/>
+        </w:numPr>
+      </w:pPr>
+      <w:proofErr w:type="spellStart"/>
+      <w:r>
+        <w:t>mirtrace</w:t>
+      </w:r>
+      <w:proofErr w:type="spellEnd"/>
+    </w:p>
+    <w:p>
+      <w:pPr>
+        <w:pStyle w:val="ListParagraph"/>
+        <w:numPr>
+          <w:ilvl w:val="6"/>
+          <w:numId w:val="1"/>
+        </w:numPr>
+      </w:pPr>
+      <w:r>
+        <w:t>qc</w:t>
+      </w:r>
+    </w:p>
+    <w:p>
+      <w:pPr>
+        <w:pStyle w:val="ListParagraph"/>
+        <w:numPr>
+          <w:ilvl w:val="6"/>
+          <w:numId w:val="1"/>
+        </w:numPr>
+      </w:pPr>
+      <w:r>
+        <w:t>trace</w:t>
       </w:r>
     </w:p>
     <w:p>
@@ -509,7 +872,7 @@
         </w:numPr>
       </w:pPr>
       <w:r>
-        <w:t>results</w:t>
+        <w:t>logs</w:t>
       </w:r>
     </w:p>
     <w:p>
@@ -521,7 +884,7 @@
         </w:numPr>
       </w:pPr>
       <w:r>
-        <w:t>reports</w:t>
+        <w:t>02_quality_control</w:t>
       </w:r>
     </w:p>
     <w:p>
@@ -532,34 +895,32 @@
           <w:numId w:val="1"/>
         </w:numPr>
       </w:pPr>
-      <w:proofErr w:type="spellStart"/>
-      <w:r>
-        <w:t>fastqc</w:t>
-      </w:r>
-      <w:proofErr w:type="spellEnd"/>
-    </w:p>
-    <w:p>
-      <w:pPr>
-        <w:pStyle w:val="ListParagraph"/>
-        <w:numPr>
-          <w:ilvl w:val="2"/>
-          <w:numId w:val="1"/>
-        </w:numPr>
-      </w:pPr>
-      <w:r>
-        <w:t>tables</w:t>
-      </w:r>
-    </w:p>
-    <w:p>
-      <w:pPr>
-        <w:pStyle w:val="ListParagraph"/>
-        <w:numPr>
-          <w:ilvl w:val="2"/>
-          <w:numId w:val="1"/>
-        </w:numPr>
-      </w:pPr>
-      <w:r>
-        <w:t>figures</w:t>
+      <w:r>
+        <w:t>02a_raw_reads_qc</w:t>
+      </w:r>
+    </w:p>
+    <w:p>
+      <w:pPr>
+        <w:pStyle w:val="ListParagraph"/>
+        <w:numPr>
+          <w:ilvl w:val="3"/>
+          <w:numId w:val="1"/>
+        </w:numPr>
+      </w:pPr>
+      <w:r>
+        <w:t>02b_trimming</w:t>
+      </w:r>
+    </w:p>
+    <w:p>
+      <w:pPr>
+        <w:pStyle w:val="ListParagraph"/>
+        <w:numPr>
+          <w:ilvl w:val="3"/>
+          <w:numId w:val="1"/>
+        </w:numPr>
+      </w:pPr>
+      <w:r>
+        <w:t>02c_trimmed_reads_qc</w:t>
       </w:r>
     </w:p>
     <w:p>
@@ -571,7 +932,7 @@
         </w:numPr>
       </w:pPr>
       <w:r>
-        <w:t>logs</w:t>
+        <w:t>investigations</w:t>
       </w:r>
     </w:p>
     <w:p>
@@ -607,7 +968,6 @@
         </w:numPr>
       </w:pPr>
       <w:r>
-        <w:lastRenderedPageBreak/>
         <w:t>Installation.md</w:t>
       </w:r>
     </w:p>
@@ -702,7 +1062,7 @@
         <w:rFonts w:ascii="Symbol" w:hAnsi="Symbol" w:hint="default"/>
       </w:rPr>
     </w:lvl>
-    <w:lvl w:ilvl="4" w:tplc="08090003" w:tentative="1">
+    <w:lvl w:ilvl="4" w:tplc="08090003">
       <w:start w:val="1"/>
       <w:numFmt w:val="bullet"/>
       <w:lvlText w:val="o"/>
@@ -714,7 +1074,7 @@
         <w:rFonts w:ascii="Courier New" w:hAnsi="Courier New" w:hint="default"/>
       </w:rPr>
     </w:lvl>
-    <w:lvl w:ilvl="5" w:tplc="08090005" w:tentative="1">
+    <w:lvl w:ilvl="5" w:tplc="08090005">
       <w:start w:val="1"/>
       <w:numFmt w:val="bullet"/>
       <w:lvlText w:val=""/>
@@ -726,7 +1086,7 @@
         <w:rFonts w:ascii="Wingdings" w:hAnsi="Wingdings" w:hint="default"/>
       </w:rPr>
     </w:lvl>
-    <w:lvl w:ilvl="6" w:tplc="08090001" w:tentative="1">
+    <w:lvl w:ilvl="6" w:tplc="08090001">
       <w:start w:val="1"/>
       <w:numFmt w:val="bullet"/>
       <w:lvlText w:val=""/>

</xml_diff>

<commit_message>
ADDING TODAY'S WORK - 12.05.2026
</commit_message>
<xml_diff>
--- a/01_Protease/docs/plans/L4137_project_structure.docx
+++ b/01_Protease/docs/plans/L4137_project_structure.docx
@@ -474,11 +474,61 @@
       </w:r>
     </w:p>
     <w:p>
+      <w:pPr>
+        <w:pStyle w:val="ListParagraph"/>
+        <w:numPr>
+          <w:ilvl w:val="0"/>
+          <w:numId w:val="3"/>
+        </w:numPr>
+      </w:pPr>
+      <w:r>
+        <w:t xml:space="preserve">Need to redirect outputs (e.g., trimming) to ‘processed data’ to match the style of L4136 </w:t>
+      </w:r>
+      <w:proofErr w:type="spellStart"/>
+      <w:r>
+        <w:t>github</w:t>
+      </w:r>
+      <w:proofErr w:type="spellEnd"/>
+      <w:r>
+        <w:t xml:space="preserve"> – it is separated by </w:t>
+      </w:r>
+      <w:proofErr w:type="spellStart"/>
+      <w:r>
+        <w:t>methods_section</w:t>
+      </w:r>
+      <w:proofErr w:type="spellEnd"/>
+      <w:r>
+        <w:t xml:space="preserve"> currently to retain organisation</w:t>
+      </w:r>
+    </w:p>
+    <w:p>
+      <w:pPr>
+        <w:pStyle w:val="ListParagraph"/>
+        <w:numPr>
+          <w:ilvl w:val="0"/>
+          <w:numId w:val="3"/>
+        </w:numPr>
+      </w:pPr>
+      <w:r>
+        <w:t>Need to do an investigation to compare using reads that were trimmed with a max read length defined vs no max read length. See i_120526_01 outcome for more details.</w:t>
+      </w:r>
+    </w:p>
+    <w:p>
+      <w:pPr>
+        <w:pStyle w:val="ListParagraph"/>
+        <w:numPr>
+          <w:ilvl w:val="0"/>
+          <w:numId w:val="3"/>
+        </w:numPr>
+      </w:pPr>
+    </w:p>
+    <w:p>
       <w:r>
         <w:rPr>
           <w:b/>
           <w:bCs/>
         </w:rPr>
+        <w:lastRenderedPageBreak/>
         <w:t>Structure</w:t>
       </w:r>
     </w:p>
@@ -569,429 +619,415 @@
         </w:numPr>
       </w:pPr>
       <w:r>
+        <w:t>01_data_preparation</w:t>
+      </w:r>
+    </w:p>
+    <w:p>
+      <w:pPr>
+        <w:pStyle w:val="ListParagraph"/>
+        <w:numPr>
+          <w:ilvl w:val="2"/>
+          <w:numId w:val="1"/>
+        </w:numPr>
+      </w:pPr>
+      <w:r>
+        <w:t>02_quality_control</w:t>
+      </w:r>
+    </w:p>
+    <w:p>
+      <w:pPr>
+        <w:pStyle w:val="ListParagraph"/>
+        <w:numPr>
+          <w:ilvl w:val="3"/>
+          <w:numId w:val="1"/>
+        </w:numPr>
+      </w:pPr>
+      <w:r>
+        <w:t>02a_raw_reads_qc</w:t>
+      </w:r>
+    </w:p>
+    <w:p>
+      <w:pPr>
+        <w:pStyle w:val="ListParagraph"/>
+        <w:numPr>
+          <w:ilvl w:val="3"/>
+          <w:numId w:val="1"/>
+        </w:numPr>
+      </w:pPr>
+      <w:r>
+        <w:t>02b_trimming</w:t>
+      </w:r>
+    </w:p>
+    <w:p>
+      <w:pPr>
+        <w:pStyle w:val="ListParagraph"/>
+        <w:numPr>
+          <w:ilvl w:val="3"/>
+          <w:numId w:val="1"/>
+        </w:numPr>
+      </w:pPr>
+      <w:r>
+        <w:t>02c_trimmed_reads_qc</w:t>
+      </w:r>
+    </w:p>
+    <w:p>
+      <w:pPr>
+        <w:pStyle w:val="ListParagraph"/>
+        <w:numPr>
+          <w:ilvl w:val="1"/>
+          <w:numId w:val="1"/>
+        </w:numPr>
+      </w:pPr>
+      <w:r>
+        <w:t>results</w:t>
+      </w:r>
+    </w:p>
+    <w:p>
+      <w:pPr>
+        <w:pStyle w:val="ListParagraph"/>
+        <w:numPr>
+          <w:ilvl w:val="2"/>
+          <w:numId w:val="1"/>
+        </w:numPr>
+      </w:pPr>
+      <w:r>
+        <w:t>reports</w:t>
+      </w:r>
+    </w:p>
+    <w:p>
+      <w:pPr>
+        <w:pStyle w:val="ListParagraph"/>
+        <w:numPr>
+          <w:ilvl w:val="2"/>
+          <w:numId w:val="1"/>
+        </w:numPr>
+      </w:pPr>
+      <w:r>
+        <w:t>tables</w:t>
+      </w:r>
+    </w:p>
+    <w:p>
+      <w:pPr>
+        <w:pStyle w:val="ListParagraph"/>
+        <w:numPr>
+          <w:ilvl w:val="2"/>
+          <w:numId w:val="1"/>
+        </w:numPr>
+      </w:pPr>
+      <w:r>
+        <w:t>figures</w:t>
+      </w:r>
+    </w:p>
+    <w:p>
+      <w:pPr>
+        <w:pStyle w:val="ListParagraph"/>
+        <w:numPr>
+          <w:ilvl w:val="2"/>
+          <w:numId w:val="1"/>
+        </w:numPr>
+      </w:pPr>
+      <w:proofErr w:type="spellStart"/>
+      <w:r>
+        <w:t>methods_sections</w:t>
+      </w:r>
+      <w:proofErr w:type="spellEnd"/>
+    </w:p>
+    <w:p>
+      <w:pPr>
+        <w:pStyle w:val="ListParagraph"/>
+        <w:numPr>
+          <w:ilvl w:val="3"/>
+          <w:numId w:val="1"/>
+        </w:numPr>
+      </w:pPr>
+      <w:r>
+        <w:t>02_quality_control</w:t>
+      </w:r>
+    </w:p>
+    <w:p>
+      <w:pPr>
+        <w:pStyle w:val="ListParagraph"/>
+        <w:numPr>
+          <w:ilvl w:val="4"/>
+          <w:numId w:val="1"/>
+        </w:numPr>
+      </w:pPr>
+      <w:r>
+        <w:t>02a_raw_reads_qc</w:t>
+      </w:r>
+    </w:p>
+    <w:p>
+      <w:pPr>
+        <w:pStyle w:val="ListParagraph"/>
+        <w:numPr>
+          <w:ilvl w:val="5"/>
+          <w:numId w:val="1"/>
+        </w:numPr>
+      </w:pPr>
+      <w:proofErr w:type="spellStart"/>
+      <w:r>
+        <w:t>fastqc</w:t>
+      </w:r>
+      <w:proofErr w:type="spellEnd"/>
+    </w:p>
+    <w:p>
+      <w:pPr>
+        <w:pStyle w:val="ListParagraph"/>
+        <w:numPr>
+          <w:ilvl w:val="5"/>
+          <w:numId w:val="1"/>
+        </w:numPr>
+      </w:pPr>
+      <w:proofErr w:type="spellStart"/>
+      <w:r>
+        <w:t>mirtrace</w:t>
+      </w:r>
+      <w:proofErr w:type="spellEnd"/>
+    </w:p>
+    <w:p>
+      <w:pPr>
+        <w:pStyle w:val="ListParagraph"/>
+        <w:numPr>
+          <w:ilvl w:val="6"/>
+          <w:numId w:val="1"/>
+        </w:numPr>
+      </w:pPr>
+      <w:r>
+        <w:t>qc</w:t>
+      </w:r>
+    </w:p>
+    <w:p>
+      <w:pPr>
+        <w:pStyle w:val="ListParagraph"/>
+        <w:numPr>
+          <w:ilvl w:val="6"/>
+          <w:numId w:val="1"/>
+        </w:numPr>
+      </w:pPr>
+      <w:r>
+        <w:t>trace</w:t>
+      </w:r>
+    </w:p>
+    <w:p>
+      <w:pPr>
+        <w:pStyle w:val="ListParagraph"/>
+        <w:numPr>
+          <w:ilvl w:val="4"/>
+          <w:numId w:val="1"/>
+        </w:numPr>
+      </w:pPr>
+      <w:r>
+        <w:t>02b_trimming</w:t>
+      </w:r>
+    </w:p>
+    <w:p>
+      <w:pPr>
+        <w:pStyle w:val="ListParagraph"/>
+        <w:numPr>
+          <w:ilvl w:val="5"/>
+          <w:numId w:val="1"/>
+        </w:numPr>
+      </w:pPr>
+      <w:proofErr w:type="spellStart"/>
+      <w:r>
+        <w:t>cutadapt</w:t>
+      </w:r>
+      <w:proofErr w:type="spellEnd"/>
+    </w:p>
+    <w:p>
+      <w:pPr>
+        <w:pStyle w:val="ListParagraph"/>
+        <w:numPr>
+          <w:ilvl w:val="4"/>
+          <w:numId w:val="1"/>
+        </w:numPr>
+      </w:pPr>
+      <w:r>
+        <w:t>02c_trimmed_reads_qc</w:t>
+      </w:r>
+    </w:p>
+    <w:p>
+      <w:pPr>
+        <w:pStyle w:val="ListParagraph"/>
+        <w:numPr>
+          <w:ilvl w:val="5"/>
+          <w:numId w:val="1"/>
+        </w:numPr>
+      </w:pPr>
+      <w:proofErr w:type="spellStart"/>
+      <w:r>
+        <w:t>fastqc</w:t>
+      </w:r>
+      <w:proofErr w:type="spellEnd"/>
+    </w:p>
+    <w:p>
+      <w:pPr>
+        <w:pStyle w:val="ListParagraph"/>
+        <w:numPr>
+          <w:ilvl w:val="5"/>
+          <w:numId w:val="1"/>
+        </w:numPr>
+      </w:pPr>
+      <w:proofErr w:type="spellStart"/>
+      <w:r>
+        <w:t>mirtrace</w:t>
+      </w:r>
+      <w:proofErr w:type="spellEnd"/>
+    </w:p>
+    <w:p>
+      <w:pPr>
+        <w:pStyle w:val="ListParagraph"/>
+        <w:numPr>
+          <w:ilvl w:val="6"/>
+          <w:numId w:val="1"/>
+        </w:numPr>
+      </w:pPr>
+      <w:r>
+        <w:t>qc</w:t>
+      </w:r>
+    </w:p>
+    <w:p>
+      <w:pPr>
+        <w:pStyle w:val="ListParagraph"/>
+        <w:numPr>
+          <w:ilvl w:val="6"/>
+          <w:numId w:val="1"/>
+        </w:numPr>
+      </w:pPr>
+      <w:r>
+        <w:t>trace</w:t>
+      </w:r>
+    </w:p>
+    <w:p>
+      <w:pPr>
+        <w:pStyle w:val="ListParagraph"/>
+        <w:numPr>
+          <w:ilvl w:val="1"/>
+          <w:numId w:val="1"/>
+        </w:numPr>
+      </w:pPr>
+      <w:r>
+        <w:t>logs</w:t>
+      </w:r>
+    </w:p>
+    <w:p>
+      <w:pPr>
+        <w:pStyle w:val="ListParagraph"/>
+        <w:numPr>
+          <w:ilvl w:val="2"/>
+          <w:numId w:val="1"/>
+        </w:numPr>
+      </w:pPr>
+      <w:r>
+        <w:t>02_quality_control</w:t>
+      </w:r>
+    </w:p>
+    <w:p>
+      <w:pPr>
+        <w:pStyle w:val="ListParagraph"/>
+        <w:numPr>
+          <w:ilvl w:val="3"/>
+          <w:numId w:val="1"/>
+        </w:numPr>
+      </w:pPr>
+      <w:r>
+        <w:t>02a_raw_reads_qc</w:t>
+      </w:r>
+    </w:p>
+    <w:p>
+      <w:pPr>
+        <w:pStyle w:val="ListParagraph"/>
+        <w:numPr>
+          <w:ilvl w:val="3"/>
+          <w:numId w:val="1"/>
+        </w:numPr>
+      </w:pPr>
+      <w:r>
+        <w:t>02b_trimming</w:t>
+      </w:r>
+    </w:p>
+    <w:p>
+      <w:pPr>
+        <w:pStyle w:val="ListParagraph"/>
+        <w:numPr>
+          <w:ilvl w:val="3"/>
+          <w:numId w:val="1"/>
+        </w:numPr>
+      </w:pPr>
+      <w:r>
+        <w:t>02c_trimmed_reads_qc</w:t>
+      </w:r>
+    </w:p>
+    <w:p>
+      <w:pPr>
+        <w:pStyle w:val="ListParagraph"/>
+        <w:numPr>
+          <w:ilvl w:val="1"/>
+          <w:numId w:val="1"/>
+        </w:numPr>
+      </w:pPr>
+      <w:r>
+        <w:t>investigations</w:t>
+      </w:r>
+    </w:p>
+    <w:p>
+      <w:pPr>
+        <w:pStyle w:val="ListParagraph"/>
+        <w:numPr>
+          <w:ilvl w:val="0"/>
+          <w:numId w:val="1"/>
+        </w:numPr>
+      </w:pPr>
+      <w:r>
+        <w:t>02_HDM_Dog</w:t>
+      </w:r>
+    </w:p>
+    <w:p>
+      <w:pPr>
+        <w:pStyle w:val="ListParagraph"/>
+        <w:numPr>
+          <w:ilvl w:val="1"/>
+          <w:numId w:val="1"/>
+        </w:numPr>
+      </w:pPr>
+      <w:r>
+        <w:t>scripts</w:t>
+      </w:r>
+    </w:p>
+    <w:p>
+      <w:pPr>
+        <w:pStyle w:val="ListParagraph"/>
+        <w:numPr>
+          <w:ilvl w:val="0"/>
+          <w:numId w:val="1"/>
+        </w:numPr>
+      </w:pPr>
+      <w:r>
+        <w:t>Installation.md</w:t>
+      </w:r>
+    </w:p>
+    <w:p>
+      <w:pPr>
+        <w:pStyle w:val="ListParagraph"/>
+        <w:numPr>
+          <w:ilvl w:val="0"/>
+          <w:numId w:val="1"/>
+        </w:numPr>
+      </w:pPr>
+      <w:r>
+        <w:t>Citations.md</w:t>
+      </w:r>
+    </w:p>
+    <w:p>
+      <w:pPr>
+        <w:pStyle w:val="ListParagraph"/>
+        <w:numPr>
+          <w:ilvl w:val="0"/>
+          <w:numId w:val="1"/>
+        </w:numPr>
+      </w:pPr>
+      <w:r>
         <w:lastRenderedPageBreak/>
-        <w:t>01_data_preparation</w:t>
-      </w:r>
-    </w:p>
-    <w:p>
-      <w:pPr>
-        <w:pStyle w:val="ListParagraph"/>
-        <w:numPr>
-          <w:ilvl w:val="2"/>
-          <w:numId w:val="1"/>
-        </w:numPr>
-      </w:pPr>
-      <w:r>
-        <w:t>02_quality_control</w:t>
-      </w:r>
-    </w:p>
-    <w:p>
-      <w:pPr>
-        <w:pStyle w:val="ListParagraph"/>
-        <w:numPr>
-          <w:ilvl w:val="3"/>
-          <w:numId w:val="1"/>
-        </w:numPr>
-      </w:pPr>
-      <w:r>
-        <w:t>02a_raw_reads_qc</w:t>
-      </w:r>
-    </w:p>
-    <w:p>
-      <w:pPr>
-        <w:pStyle w:val="ListParagraph"/>
-        <w:numPr>
-          <w:ilvl w:val="3"/>
-          <w:numId w:val="1"/>
-        </w:numPr>
-      </w:pPr>
-      <w:r>
-        <w:t>02b_trimming</w:t>
-      </w:r>
-    </w:p>
-    <w:p>
-      <w:pPr>
-        <w:pStyle w:val="ListParagraph"/>
-        <w:numPr>
-          <w:ilvl w:val="3"/>
-          <w:numId w:val="1"/>
-        </w:numPr>
-      </w:pPr>
-      <w:r>
-        <w:t>02c_trimmed_reads_qc</w:t>
-      </w:r>
-    </w:p>
-    <w:p>
-      <w:pPr>
-        <w:pStyle w:val="ListParagraph"/>
-        <w:numPr>
-          <w:ilvl w:val="1"/>
-          <w:numId w:val="1"/>
-        </w:numPr>
-      </w:pPr>
-      <w:r>
-        <w:t>results</w:t>
-      </w:r>
-    </w:p>
-    <w:p>
-      <w:pPr>
-        <w:pStyle w:val="ListParagraph"/>
-        <w:numPr>
-          <w:ilvl w:val="2"/>
-          <w:numId w:val="1"/>
-        </w:numPr>
-      </w:pPr>
-      <w:r>
-        <w:t>reports</w:t>
-      </w:r>
-    </w:p>
-    <w:p>
-      <w:pPr>
-        <w:pStyle w:val="ListParagraph"/>
-        <w:numPr>
-          <w:ilvl w:val="2"/>
-          <w:numId w:val="1"/>
-        </w:numPr>
-      </w:pPr>
-      <w:r>
-        <w:t>tables</w:t>
-      </w:r>
-    </w:p>
-    <w:p>
-      <w:pPr>
-        <w:pStyle w:val="ListParagraph"/>
-        <w:numPr>
-          <w:ilvl w:val="2"/>
-          <w:numId w:val="1"/>
-        </w:numPr>
-      </w:pPr>
-      <w:r>
-        <w:t>figures</w:t>
-      </w:r>
-    </w:p>
-    <w:p>
-      <w:pPr>
-        <w:pStyle w:val="ListParagraph"/>
-        <w:numPr>
-          <w:ilvl w:val="2"/>
-          <w:numId w:val="1"/>
-        </w:numPr>
-      </w:pPr>
-      <w:proofErr w:type="spellStart"/>
-      <w:r>
-        <w:t>methods_sections</w:t>
-      </w:r>
-      <w:proofErr w:type="spellEnd"/>
-    </w:p>
-    <w:p>
-      <w:pPr>
-        <w:pStyle w:val="ListParagraph"/>
-        <w:numPr>
-          <w:ilvl w:val="3"/>
-          <w:numId w:val="1"/>
-        </w:numPr>
-      </w:pPr>
-      <w:r>
-        <w:t>02_quality_control</w:t>
-      </w:r>
-    </w:p>
-    <w:p>
-      <w:pPr>
-        <w:pStyle w:val="ListParagraph"/>
-        <w:numPr>
-          <w:ilvl w:val="4"/>
-          <w:numId w:val="1"/>
-        </w:numPr>
-      </w:pPr>
-      <w:r>
-        <w:t>02a_raw_reads_qc</w:t>
-      </w:r>
-    </w:p>
-    <w:p>
-      <w:pPr>
-        <w:pStyle w:val="ListParagraph"/>
-        <w:numPr>
-          <w:ilvl w:val="5"/>
-          <w:numId w:val="1"/>
-        </w:numPr>
-      </w:pPr>
-      <w:proofErr w:type="spellStart"/>
-      <w:r>
-        <w:t>fastqc</w:t>
-      </w:r>
-      <w:proofErr w:type="spellEnd"/>
-    </w:p>
-    <w:p>
-      <w:pPr>
-        <w:pStyle w:val="ListParagraph"/>
-        <w:numPr>
-          <w:ilvl w:val="5"/>
-          <w:numId w:val="1"/>
-        </w:numPr>
-      </w:pPr>
-      <w:proofErr w:type="spellStart"/>
-      <w:r>
-        <w:t>mirtrace</w:t>
-      </w:r>
-      <w:proofErr w:type="spellEnd"/>
-    </w:p>
-    <w:p>
-      <w:pPr>
-        <w:pStyle w:val="ListParagraph"/>
-        <w:numPr>
-          <w:ilvl w:val="6"/>
-          <w:numId w:val="1"/>
-        </w:numPr>
-      </w:pPr>
-      <w:r>
-        <w:t>qc</w:t>
-      </w:r>
-    </w:p>
-    <w:p>
-      <w:pPr>
-        <w:pStyle w:val="ListParagraph"/>
-        <w:numPr>
-          <w:ilvl w:val="6"/>
-          <w:numId w:val="1"/>
-        </w:numPr>
-      </w:pPr>
-      <w:r>
-        <w:t>trace</w:t>
-      </w:r>
-    </w:p>
-    <w:p>
-      <w:pPr>
-        <w:pStyle w:val="ListParagraph"/>
-        <w:numPr>
-          <w:ilvl w:val="4"/>
-          <w:numId w:val="1"/>
-        </w:numPr>
-      </w:pPr>
-      <w:r>
-        <w:t>02b_trimming</w:t>
-      </w:r>
-    </w:p>
-    <w:p>
-      <w:pPr>
-        <w:pStyle w:val="ListParagraph"/>
-        <w:numPr>
-          <w:ilvl w:val="5"/>
-          <w:numId w:val="1"/>
-        </w:numPr>
-      </w:pPr>
-      <w:proofErr w:type="spellStart"/>
-      <w:r>
-        <w:t>cutadapt</w:t>
-      </w:r>
-      <w:proofErr w:type="spellEnd"/>
-    </w:p>
-    <w:p>
-      <w:pPr>
-        <w:pStyle w:val="ListParagraph"/>
-        <w:numPr>
-          <w:ilvl w:val="5"/>
-          <w:numId w:val="1"/>
-        </w:numPr>
-      </w:pPr>
-      <w:proofErr w:type="spellStart"/>
-      <w:r>
-        <w:t>fastp</w:t>
-      </w:r>
-      <w:proofErr w:type="spellEnd"/>
-    </w:p>
-    <w:p>
-      <w:pPr>
-        <w:pStyle w:val="ListParagraph"/>
-        <w:numPr>
-          <w:ilvl w:val="4"/>
-          <w:numId w:val="1"/>
-        </w:numPr>
-      </w:pPr>
-      <w:r>
-        <w:t>02c_trimmed_reads_qc</w:t>
-      </w:r>
-    </w:p>
-    <w:p>
-      <w:pPr>
-        <w:pStyle w:val="ListParagraph"/>
-        <w:numPr>
-          <w:ilvl w:val="5"/>
-          <w:numId w:val="1"/>
-        </w:numPr>
-      </w:pPr>
-      <w:proofErr w:type="spellStart"/>
-      <w:r>
-        <w:t>fastqc</w:t>
-      </w:r>
-      <w:proofErr w:type="spellEnd"/>
-    </w:p>
-    <w:p>
-      <w:pPr>
-        <w:pStyle w:val="ListParagraph"/>
-        <w:numPr>
-          <w:ilvl w:val="5"/>
-          <w:numId w:val="1"/>
-        </w:numPr>
-      </w:pPr>
-      <w:proofErr w:type="spellStart"/>
-      <w:r>
-        <w:t>mirtrace</w:t>
-      </w:r>
-      <w:proofErr w:type="spellEnd"/>
-    </w:p>
-    <w:p>
-      <w:pPr>
-        <w:pStyle w:val="ListParagraph"/>
-        <w:numPr>
-          <w:ilvl w:val="6"/>
-          <w:numId w:val="1"/>
-        </w:numPr>
-      </w:pPr>
-      <w:r>
-        <w:t>qc</w:t>
-      </w:r>
-    </w:p>
-    <w:p>
-      <w:pPr>
-        <w:pStyle w:val="ListParagraph"/>
-        <w:numPr>
-          <w:ilvl w:val="6"/>
-          <w:numId w:val="1"/>
-        </w:numPr>
-      </w:pPr>
-      <w:r>
-        <w:t>trace</w:t>
-      </w:r>
-    </w:p>
-    <w:p>
-      <w:pPr>
-        <w:pStyle w:val="ListParagraph"/>
-        <w:numPr>
-          <w:ilvl w:val="1"/>
-          <w:numId w:val="1"/>
-        </w:numPr>
-      </w:pPr>
-      <w:r>
-        <w:t>logs</w:t>
-      </w:r>
-    </w:p>
-    <w:p>
-      <w:pPr>
-        <w:pStyle w:val="ListParagraph"/>
-        <w:numPr>
-          <w:ilvl w:val="2"/>
-          <w:numId w:val="1"/>
-        </w:numPr>
-      </w:pPr>
-      <w:r>
-        <w:t>02_quality_control</w:t>
-      </w:r>
-    </w:p>
-    <w:p>
-      <w:pPr>
-        <w:pStyle w:val="ListParagraph"/>
-        <w:numPr>
-          <w:ilvl w:val="3"/>
-          <w:numId w:val="1"/>
-        </w:numPr>
-      </w:pPr>
-      <w:r>
-        <w:t>02a_raw_reads_qc</w:t>
-      </w:r>
-    </w:p>
-    <w:p>
-      <w:pPr>
-        <w:pStyle w:val="ListParagraph"/>
-        <w:numPr>
-          <w:ilvl w:val="3"/>
-          <w:numId w:val="1"/>
-        </w:numPr>
-      </w:pPr>
-      <w:r>
-        <w:t>02b_trimming</w:t>
-      </w:r>
-    </w:p>
-    <w:p>
-      <w:pPr>
-        <w:pStyle w:val="ListParagraph"/>
-        <w:numPr>
-          <w:ilvl w:val="3"/>
-          <w:numId w:val="1"/>
-        </w:numPr>
-      </w:pPr>
-      <w:r>
-        <w:t>02c_trimmed_reads_qc</w:t>
-      </w:r>
-    </w:p>
-    <w:p>
-      <w:pPr>
-        <w:pStyle w:val="ListParagraph"/>
-        <w:numPr>
-          <w:ilvl w:val="1"/>
-          <w:numId w:val="1"/>
-        </w:numPr>
-      </w:pPr>
-      <w:r>
-        <w:t>investigations</w:t>
-      </w:r>
-    </w:p>
-    <w:p>
-      <w:pPr>
-        <w:pStyle w:val="ListParagraph"/>
-        <w:numPr>
-          <w:ilvl w:val="0"/>
-          <w:numId w:val="1"/>
-        </w:numPr>
-      </w:pPr>
-      <w:r>
-        <w:t>02_HDM_Dog</w:t>
-      </w:r>
-    </w:p>
-    <w:p>
-      <w:pPr>
-        <w:pStyle w:val="ListParagraph"/>
-        <w:numPr>
-          <w:ilvl w:val="1"/>
-          <w:numId w:val="1"/>
-        </w:numPr>
-      </w:pPr>
-      <w:r>
-        <w:t>scripts</w:t>
-      </w:r>
-    </w:p>
-    <w:p>
-      <w:pPr>
-        <w:pStyle w:val="ListParagraph"/>
-        <w:numPr>
-          <w:ilvl w:val="0"/>
-          <w:numId w:val="1"/>
-        </w:numPr>
-      </w:pPr>
-      <w:r>
-        <w:t>Installation.md</w:t>
-      </w:r>
-    </w:p>
-    <w:p>
-      <w:pPr>
-        <w:pStyle w:val="ListParagraph"/>
-        <w:numPr>
-          <w:ilvl w:val="0"/>
-          <w:numId w:val="1"/>
-        </w:numPr>
-      </w:pPr>
-      <w:r>
-        <w:t>Citations.md</w:t>
-      </w:r>
-    </w:p>
-    <w:p>
-      <w:pPr>
-        <w:pStyle w:val="ListParagraph"/>
-        <w:numPr>
-          <w:ilvl w:val="0"/>
-          <w:numId w:val="1"/>
-        </w:numPr>
-      </w:pPr>
-      <w:r>
         <w:t>Repository_structure.md</w:t>
       </w:r>
     </w:p>

</xml_diff>

<commit_message>
ADDING TODAY'S WORK - 13.05.2026
</commit_message>
<xml_diff>
--- a/01_Protease/docs/plans/L4137_project_structure.docx
+++ b/01_Protease/docs/plans/L4137_project_structure.docx
@@ -587,6 +587,30 @@
       <w:pPr>
         <w:pStyle w:val="ListParagraph"/>
         <w:numPr>
+          <w:ilvl w:val="3"/>
+          <w:numId w:val="1"/>
+        </w:numPr>
+      </w:pPr>
+      <w:r>
+        <w:t>trimmed</w:t>
+      </w:r>
+    </w:p>
+    <w:p>
+      <w:pPr>
+        <w:pStyle w:val="ListParagraph"/>
+        <w:numPr>
+          <w:ilvl w:val="3"/>
+          <w:numId w:val="1"/>
+        </w:numPr>
+      </w:pPr>
+      <w:r>
+        <w:t>aligned</w:t>
+      </w:r>
+    </w:p>
+    <w:p>
+      <w:pPr>
+        <w:pStyle w:val="ListParagraph"/>
+        <w:numPr>
           <w:ilvl w:val="2"/>
           <w:numId w:val="1"/>
         </w:numPr>
@@ -599,6 +623,15 @@
       <w:pPr>
         <w:pStyle w:val="ListParagraph"/>
         <w:numPr>
+          <w:ilvl w:val="3"/>
+          <w:numId w:val="1"/>
+        </w:numPr>
+      </w:pPr>
+    </w:p>
+    <w:p>
+      <w:pPr>
+        <w:pStyle w:val="ListParagraph"/>
+        <w:numPr>
           <w:ilvl w:val="1"/>
           <w:numId w:val="1"/>
         </w:numPr>
@@ -645,6 +678,9 @@
       <w:r>
         <w:t>02a_raw_reads_qc</w:t>
       </w:r>
+      <w:r>
+        <w:t>.sh</w:t>
+      </w:r>
     </w:p>
     <w:p>
       <w:pPr>
@@ -657,6 +693,9 @@
       <w:r>
         <w:t>02b_trimming</w:t>
       </w:r>
+      <w:r>
+        <w:t>.sh</w:t>
+      </w:r>
     </w:p>
     <w:p>
       <w:pPr>
@@ -669,6 +708,51 @@
       <w:r>
         <w:t>02c_trimmed_reads_qc</w:t>
       </w:r>
+      <w:r>
+        <w:t>.sh</w:t>
+      </w:r>
+    </w:p>
+    <w:p>
+      <w:pPr>
+        <w:pStyle w:val="ListParagraph"/>
+        <w:numPr>
+          <w:ilvl w:val="2"/>
+          <w:numId w:val="1"/>
+        </w:numPr>
+      </w:pPr>
+      <w:r>
+        <w:t>03_alignment</w:t>
+      </w:r>
+    </w:p>
+    <w:p>
+      <w:pPr>
+        <w:pStyle w:val="ListParagraph"/>
+        <w:numPr>
+          <w:ilvl w:val="3"/>
+          <w:numId w:val="1"/>
+        </w:numPr>
+      </w:pPr>
+      <w:r>
+        <w:t>03a_download_reference</w:t>
+      </w:r>
+      <w:r>
+        <w:t>.sh</w:t>
+      </w:r>
+    </w:p>
+    <w:p>
+      <w:pPr>
+        <w:pStyle w:val="ListParagraph"/>
+        <w:numPr>
+          <w:ilvl w:val="3"/>
+          <w:numId w:val="1"/>
+        </w:numPr>
+      </w:pPr>
+      <w:r>
+        <w:t>03b_read_alignment</w:t>
+      </w:r>
+      <w:r>
+        <w:t>.sh</w:t>
+      </w:r>
     </w:p>
     <w:p>
       <w:pPr>
@@ -955,6 +1039,7 @@
         </w:numPr>
       </w:pPr>
       <w:r>
+        <w:lastRenderedPageBreak/>
         <w:t>02c_trimmed_reads_qc</w:t>
       </w:r>
     </w:p>
@@ -1027,7 +1112,6 @@
         </w:numPr>
       </w:pPr>
       <w:r>
-        <w:lastRenderedPageBreak/>
         <w:t>Repository_structure.md</w:t>
       </w:r>
     </w:p>

</xml_diff>

<commit_message>
ADDING TODAY'S WORK - 14.05.2026
</commit_message>
<xml_diff>
--- a/01_Protease/docs/plans/L4137_project_structure.docx
+++ b/01_Protease/docs/plans/L4137_project_structure.docx
@@ -521,6 +521,43 @@
           <w:numId w:val="3"/>
         </w:numPr>
       </w:pPr>
+      <w:r>
+        <w:lastRenderedPageBreak/>
+        <w:t xml:space="preserve">Look at timestamps in log.txt files for each section to </w:t>
+      </w:r>
+      <w:r>
+        <w:t>get estimated run time to include in script READMEs</w:t>
+      </w:r>
+    </w:p>
+    <w:p>
+      <w:pPr>
+        <w:pStyle w:val="ListParagraph"/>
+        <w:numPr>
+          <w:ilvl w:val="0"/>
+          <w:numId w:val="3"/>
+        </w:numPr>
+      </w:pPr>
+      <w:r>
+        <w:t>Replace all short-style flags ‘-t’ with long flags ‘—threads’ because this makes it more readable</w:t>
+      </w:r>
+    </w:p>
+    <w:p>
+      <w:pPr>
+        <w:pStyle w:val="ListParagraph"/>
+        <w:numPr>
+          <w:ilvl w:val="0"/>
+          <w:numId w:val="3"/>
+        </w:numPr>
+      </w:pPr>
+      <w:r>
+        <w:t>The order of i</w:t>
+      </w:r>
+      <w:r>
+        <w:t xml:space="preserve">nput/output directories and files should be inverted so it is directories first because you need directories </w:t>
+      </w:r>
+      <w:r>
+        <w:t>for the files to go in</w:t>
+      </w:r>
     </w:p>
     <w:p>
       <w:r>
@@ -528,24 +565,492 @@
           <w:b/>
           <w:bCs/>
         </w:rPr>
+        <w:t>Structure</w:t>
+      </w:r>
+    </w:p>
+    <w:p>
+      <w:pPr>
+        <w:pStyle w:val="ListParagraph"/>
+        <w:numPr>
+          <w:ilvl w:val="0"/>
+          <w:numId w:val="1"/>
+        </w:numPr>
+      </w:pPr>
+      <w:r>
+        <w:t>0</w:t>
+      </w:r>
+      <w:r>
+        <w:t>1_Protease</w:t>
+      </w:r>
+    </w:p>
+    <w:p>
+      <w:pPr>
+        <w:pStyle w:val="ListParagraph"/>
+        <w:numPr>
+          <w:ilvl w:val="1"/>
+          <w:numId w:val="1"/>
+        </w:numPr>
+      </w:pPr>
+      <w:r>
+        <w:t>data</w:t>
+      </w:r>
+    </w:p>
+    <w:p>
+      <w:pPr>
+        <w:pStyle w:val="ListParagraph"/>
+        <w:numPr>
+          <w:ilvl w:val="2"/>
+          <w:numId w:val="1"/>
+        </w:numPr>
+      </w:pPr>
+      <w:r>
+        <w:t>raw</w:t>
+      </w:r>
+    </w:p>
+    <w:p>
+      <w:pPr>
+        <w:pStyle w:val="ListParagraph"/>
+        <w:numPr>
+          <w:ilvl w:val="2"/>
+          <w:numId w:val="1"/>
+        </w:numPr>
+      </w:pPr>
+      <w:r>
+        <w:t>processed</w:t>
+      </w:r>
+    </w:p>
+    <w:p>
+      <w:pPr>
+        <w:pStyle w:val="ListParagraph"/>
+        <w:numPr>
+          <w:ilvl w:val="3"/>
+          <w:numId w:val="1"/>
+        </w:numPr>
+      </w:pPr>
+      <w:r>
+        <w:t>trimmed</w:t>
+      </w:r>
+    </w:p>
+    <w:p>
+      <w:pPr>
+        <w:pStyle w:val="ListParagraph"/>
+        <w:numPr>
+          <w:ilvl w:val="3"/>
+          <w:numId w:val="1"/>
+        </w:numPr>
+      </w:pPr>
+      <w:r>
+        <w:t>aligned</w:t>
+      </w:r>
+    </w:p>
+    <w:p>
+      <w:pPr>
+        <w:pStyle w:val="ListParagraph"/>
+        <w:numPr>
+          <w:ilvl w:val="2"/>
+          <w:numId w:val="1"/>
+        </w:numPr>
+      </w:pPr>
+      <w:r>
+        <w:t>reference</w:t>
+      </w:r>
+    </w:p>
+    <w:p>
+      <w:pPr>
+        <w:pStyle w:val="ListParagraph"/>
+        <w:numPr>
+          <w:ilvl w:val="3"/>
+          <w:numId w:val="1"/>
+        </w:numPr>
+      </w:pPr>
+    </w:p>
+    <w:p>
+      <w:pPr>
+        <w:pStyle w:val="ListParagraph"/>
+        <w:numPr>
+          <w:ilvl w:val="1"/>
+          <w:numId w:val="1"/>
+        </w:numPr>
+      </w:pPr>
+      <w:r>
+        <w:t>s</w:t>
+      </w:r>
+      <w:r>
+        <w:t>cripts</w:t>
+      </w:r>
+    </w:p>
+    <w:p>
+      <w:pPr>
+        <w:pStyle w:val="ListParagraph"/>
+        <w:numPr>
+          <w:ilvl w:val="2"/>
+          <w:numId w:val="1"/>
+        </w:numPr>
+      </w:pPr>
+      <w:r>
+        <w:t>01_data_preparation</w:t>
+      </w:r>
+    </w:p>
+    <w:p>
+      <w:pPr>
+        <w:pStyle w:val="ListParagraph"/>
+        <w:numPr>
+          <w:ilvl w:val="2"/>
+          <w:numId w:val="1"/>
+        </w:numPr>
+      </w:pPr>
+      <w:r>
+        <w:t>02_quality_control</w:t>
+      </w:r>
+    </w:p>
+    <w:p>
+      <w:pPr>
+        <w:pStyle w:val="ListParagraph"/>
+        <w:numPr>
+          <w:ilvl w:val="3"/>
+          <w:numId w:val="1"/>
+        </w:numPr>
+      </w:pPr>
+      <w:r>
+        <w:t>02a_raw_reads_qc</w:t>
+      </w:r>
+      <w:r>
+        <w:t>.sh</w:t>
+      </w:r>
+    </w:p>
+    <w:p>
+      <w:pPr>
+        <w:pStyle w:val="ListParagraph"/>
+        <w:numPr>
+          <w:ilvl w:val="3"/>
+          <w:numId w:val="1"/>
+        </w:numPr>
+      </w:pPr>
+      <w:r>
+        <w:t>02b_trimming</w:t>
+      </w:r>
+      <w:r>
+        <w:t>.sh</w:t>
+      </w:r>
+    </w:p>
+    <w:p>
+      <w:pPr>
+        <w:pStyle w:val="ListParagraph"/>
+        <w:numPr>
+          <w:ilvl w:val="3"/>
+          <w:numId w:val="1"/>
+        </w:numPr>
+      </w:pPr>
+      <w:r>
+        <w:t>02c_trimmed_reads_qc</w:t>
+      </w:r>
+      <w:r>
+        <w:t>.sh</w:t>
+      </w:r>
+    </w:p>
+    <w:p>
+      <w:pPr>
+        <w:pStyle w:val="ListParagraph"/>
+        <w:numPr>
+          <w:ilvl w:val="2"/>
+          <w:numId w:val="1"/>
+        </w:numPr>
+      </w:pPr>
+      <w:r>
+        <w:t>03_alignment</w:t>
+      </w:r>
+    </w:p>
+    <w:p>
+      <w:pPr>
+        <w:pStyle w:val="ListParagraph"/>
+        <w:numPr>
+          <w:ilvl w:val="3"/>
+          <w:numId w:val="1"/>
+        </w:numPr>
+      </w:pPr>
+      <w:r>
+        <w:t>03a_download_reference</w:t>
+      </w:r>
+      <w:r>
+        <w:t>.sh</w:t>
+      </w:r>
+    </w:p>
+    <w:p>
+      <w:pPr>
+        <w:pStyle w:val="ListParagraph"/>
+        <w:numPr>
+          <w:ilvl w:val="3"/>
+          <w:numId w:val="1"/>
+        </w:numPr>
+      </w:pPr>
+      <w:r>
+        <w:t>03b_read_alignment</w:t>
+      </w:r>
+      <w:r>
+        <w:t>.sh</w:t>
+      </w:r>
+    </w:p>
+    <w:p>
+      <w:pPr>
+        <w:pStyle w:val="ListParagraph"/>
+        <w:numPr>
+          <w:ilvl w:val="1"/>
+          <w:numId w:val="1"/>
+        </w:numPr>
+      </w:pPr>
+      <w:r>
+        <w:t>results</w:t>
+      </w:r>
+    </w:p>
+    <w:p>
+      <w:pPr>
+        <w:pStyle w:val="ListParagraph"/>
+        <w:numPr>
+          <w:ilvl w:val="2"/>
+          <w:numId w:val="1"/>
+        </w:numPr>
+      </w:pPr>
+      <w:r>
+        <w:t>reports</w:t>
+      </w:r>
+    </w:p>
+    <w:p>
+      <w:pPr>
+        <w:pStyle w:val="ListParagraph"/>
+        <w:numPr>
+          <w:ilvl w:val="2"/>
+          <w:numId w:val="1"/>
+        </w:numPr>
+      </w:pPr>
+      <w:r>
+        <w:t>tables</w:t>
+      </w:r>
+    </w:p>
+    <w:p>
+      <w:pPr>
+        <w:pStyle w:val="ListParagraph"/>
+        <w:numPr>
+          <w:ilvl w:val="2"/>
+          <w:numId w:val="1"/>
+        </w:numPr>
+      </w:pPr>
+      <w:r>
+        <w:t>figures</w:t>
+      </w:r>
+    </w:p>
+    <w:p>
+      <w:pPr>
+        <w:pStyle w:val="ListParagraph"/>
+        <w:numPr>
+          <w:ilvl w:val="2"/>
+          <w:numId w:val="1"/>
+        </w:numPr>
+      </w:pPr>
+      <w:proofErr w:type="spellStart"/>
+      <w:r>
+        <w:t>methods_sections</w:t>
+      </w:r>
+      <w:proofErr w:type="spellEnd"/>
+    </w:p>
+    <w:p>
+      <w:pPr>
+        <w:pStyle w:val="ListParagraph"/>
+        <w:numPr>
+          <w:ilvl w:val="3"/>
+          <w:numId w:val="1"/>
+        </w:numPr>
+      </w:pPr>
+      <w:r>
+        <w:t>01_data_preparation</w:t>
+      </w:r>
+    </w:p>
+    <w:p>
+      <w:pPr>
+        <w:pStyle w:val="ListParagraph"/>
+        <w:numPr>
+          <w:ilvl w:val="3"/>
+          <w:numId w:val="1"/>
+        </w:numPr>
+      </w:pPr>
+      <w:r>
+        <w:t>02_quality_control</w:t>
+      </w:r>
+    </w:p>
+    <w:p>
+      <w:pPr>
+        <w:pStyle w:val="ListParagraph"/>
+        <w:numPr>
+          <w:ilvl w:val="4"/>
+          <w:numId w:val="1"/>
+        </w:numPr>
+      </w:pPr>
+      <w:r>
+        <w:t>02a_raw_reads_qc</w:t>
+      </w:r>
+    </w:p>
+    <w:p>
+      <w:pPr>
+        <w:pStyle w:val="ListParagraph"/>
+        <w:numPr>
+          <w:ilvl w:val="5"/>
+          <w:numId w:val="1"/>
+        </w:numPr>
+      </w:pPr>
+      <w:proofErr w:type="spellStart"/>
+      <w:r>
+        <w:t>fastqc</w:t>
+      </w:r>
+      <w:proofErr w:type="spellEnd"/>
+    </w:p>
+    <w:p>
+      <w:pPr>
+        <w:pStyle w:val="ListParagraph"/>
+        <w:numPr>
+          <w:ilvl w:val="5"/>
+          <w:numId w:val="1"/>
+        </w:numPr>
+      </w:pPr>
+      <w:proofErr w:type="spellStart"/>
+      <w:r>
+        <w:t>mirtrace</w:t>
+      </w:r>
+      <w:proofErr w:type="spellEnd"/>
+    </w:p>
+    <w:p>
+      <w:pPr>
+        <w:pStyle w:val="ListParagraph"/>
+        <w:numPr>
+          <w:ilvl w:val="6"/>
+          <w:numId w:val="1"/>
+        </w:numPr>
+      </w:pPr>
+      <w:r>
+        <w:t>qc</w:t>
+      </w:r>
+    </w:p>
+    <w:p>
+      <w:pPr>
+        <w:pStyle w:val="ListParagraph"/>
+        <w:numPr>
+          <w:ilvl w:val="6"/>
+          <w:numId w:val="1"/>
+        </w:numPr>
+      </w:pPr>
+      <w:r>
+        <w:t>trace</w:t>
+      </w:r>
+    </w:p>
+    <w:p>
+      <w:pPr>
+        <w:pStyle w:val="ListParagraph"/>
+        <w:numPr>
+          <w:ilvl w:val="4"/>
+          <w:numId w:val="1"/>
+        </w:numPr>
+      </w:pPr>
+      <w:r>
+        <w:t>02b_trimming</w:t>
+      </w:r>
+    </w:p>
+    <w:p>
+      <w:pPr>
+        <w:pStyle w:val="ListParagraph"/>
+        <w:numPr>
+          <w:ilvl w:val="5"/>
+          <w:numId w:val="1"/>
+        </w:numPr>
+      </w:pPr>
+      <w:proofErr w:type="spellStart"/>
+      <w:r>
+        <w:t>cutadapt</w:t>
+      </w:r>
+      <w:proofErr w:type="spellEnd"/>
+    </w:p>
+    <w:p>
+      <w:pPr>
+        <w:pStyle w:val="ListParagraph"/>
+        <w:numPr>
+          <w:ilvl w:val="4"/>
+          <w:numId w:val="1"/>
+        </w:numPr>
+      </w:pPr>
+      <w:r>
+        <w:t>02c_trimmed_reads_qc</w:t>
+      </w:r>
+    </w:p>
+    <w:p>
+      <w:pPr>
+        <w:pStyle w:val="ListParagraph"/>
+        <w:numPr>
+          <w:ilvl w:val="5"/>
+          <w:numId w:val="1"/>
+        </w:numPr>
+      </w:pPr>
+      <w:proofErr w:type="spellStart"/>
+      <w:r>
         <w:lastRenderedPageBreak/>
-        <w:t>Structure</w:t>
-      </w:r>
-    </w:p>
-    <w:p>
-      <w:pPr>
-        <w:pStyle w:val="ListParagraph"/>
-        <w:numPr>
-          <w:ilvl w:val="0"/>
-          <w:numId w:val="1"/>
-        </w:numPr>
-      </w:pPr>
-      <w:r>
-        <w:t>0</w:t>
-      </w:r>
-      <w:r>
-        <w:t>1_Protease</w:t>
-      </w:r>
+        <w:t>fastqc</w:t>
+      </w:r>
+      <w:proofErr w:type="spellEnd"/>
+    </w:p>
+    <w:p>
+      <w:pPr>
+        <w:pStyle w:val="ListParagraph"/>
+        <w:numPr>
+          <w:ilvl w:val="5"/>
+          <w:numId w:val="1"/>
+        </w:numPr>
+      </w:pPr>
+      <w:proofErr w:type="spellStart"/>
+      <w:r>
+        <w:t>mirtrace</w:t>
+      </w:r>
+      <w:proofErr w:type="spellEnd"/>
+    </w:p>
+    <w:p>
+      <w:pPr>
+        <w:pStyle w:val="ListParagraph"/>
+        <w:numPr>
+          <w:ilvl w:val="6"/>
+          <w:numId w:val="1"/>
+        </w:numPr>
+      </w:pPr>
+      <w:r>
+        <w:t>qc</w:t>
+      </w:r>
+    </w:p>
+    <w:p>
+      <w:pPr>
+        <w:pStyle w:val="ListParagraph"/>
+        <w:numPr>
+          <w:ilvl w:val="6"/>
+          <w:numId w:val="1"/>
+        </w:numPr>
+      </w:pPr>
+      <w:r>
+        <w:t>trace</w:t>
+      </w:r>
+    </w:p>
+    <w:p>
+      <w:pPr>
+        <w:pStyle w:val="ListParagraph"/>
+        <w:numPr>
+          <w:ilvl w:val="3"/>
+          <w:numId w:val="1"/>
+        </w:numPr>
+      </w:pPr>
+      <w:r>
+        <w:t>03_alignment</w:t>
+      </w:r>
+    </w:p>
+    <w:p>
+      <w:pPr>
+        <w:pStyle w:val="ListParagraph"/>
+        <w:numPr>
+          <w:ilvl w:val="4"/>
+          <w:numId w:val="1"/>
+        </w:numPr>
+      </w:pPr>
     </w:p>
     <w:p>
       <w:pPr>
@@ -556,7 +1061,7 @@
         </w:numPr>
       </w:pPr>
       <w:r>
-        <w:t>data</w:t>
+        <w:t>logs</w:t>
       </w:r>
     </w:p>
     <w:p>
@@ -568,19 +1073,7 @@
         </w:numPr>
       </w:pPr>
       <w:r>
-        <w:t>raw</w:t>
-      </w:r>
-    </w:p>
-    <w:p>
-      <w:pPr>
-        <w:pStyle w:val="ListParagraph"/>
-        <w:numPr>
-          <w:ilvl w:val="2"/>
-          <w:numId w:val="1"/>
-        </w:numPr>
-      </w:pPr>
-      <w:r>
-        <w:t>processed</w:t>
+        <w:t>02_quality_control</w:t>
       </w:r>
     </w:p>
     <w:p>
@@ -592,7 +1085,7 @@
         </w:numPr>
       </w:pPr>
       <w:r>
-        <w:t>trimmed</w:t>
+        <w:t>02a_raw_reads_qc</w:t>
       </w:r>
     </w:p>
     <w:p>
@@ -604,19 +1097,7 @@
         </w:numPr>
       </w:pPr>
       <w:r>
-        <w:t>aligned</w:t>
-      </w:r>
-    </w:p>
-    <w:p>
-      <w:pPr>
-        <w:pStyle w:val="ListParagraph"/>
-        <w:numPr>
-          <w:ilvl w:val="2"/>
-          <w:numId w:val="1"/>
-        </w:numPr>
-      </w:pPr>
-      <w:r>
-        <w:t>reference</w:t>
+        <w:t>02b_trimming</w:t>
       </w:r>
     </w:p>
     <w:p>
@@ -627,419 +1108,7 @@
           <w:numId w:val="1"/>
         </w:numPr>
       </w:pPr>
-    </w:p>
-    <w:p>
-      <w:pPr>
-        <w:pStyle w:val="ListParagraph"/>
-        <w:numPr>
-          <w:ilvl w:val="1"/>
-          <w:numId w:val="1"/>
-        </w:numPr>
-      </w:pPr>
-      <w:r>
-        <w:t>s</w:t>
-      </w:r>
-      <w:r>
-        <w:t>cripts</w:t>
-      </w:r>
-    </w:p>
-    <w:p>
-      <w:pPr>
-        <w:pStyle w:val="ListParagraph"/>
-        <w:numPr>
-          <w:ilvl w:val="2"/>
-          <w:numId w:val="1"/>
-        </w:numPr>
-      </w:pPr>
-      <w:r>
-        <w:t>01_data_preparation</w:t>
-      </w:r>
-    </w:p>
-    <w:p>
-      <w:pPr>
-        <w:pStyle w:val="ListParagraph"/>
-        <w:numPr>
-          <w:ilvl w:val="2"/>
-          <w:numId w:val="1"/>
-        </w:numPr>
-      </w:pPr>
-      <w:r>
-        <w:t>02_quality_control</w:t>
-      </w:r>
-    </w:p>
-    <w:p>
-      <w:pPr>
-        <w:pStyle w:val="ListParagraph"/>
-        <w:numPr>
-          <w:ilvl w:val="3"/>
-          <w:numId w:val="1"/>
-        </w:numPr>
-      </w:pPr>
-      <w:r>
-        <w:t>02a_raw_reads_qc</w:t>
-      </w:r>
-      <w:r>
-        <w:t>.sh</w:t>
-      </w:r>
-    </w:p>
-    <w:p>
-      <w:pPr>
-        <w:pStyle w:val="ListParagraph"/>
-        <w:numPr>
-          <w:ilvl w:val="3"/>
-          <w:numId w:val="1"/>
-        </w:numPr>
-      </w:pPr>
-      <w:r>
-        <w:t>02b_trimming</w:t>
-      </w:r>
-      <w:r>
-        <w:t>.sh</w:t>
-      </w:r>
-    </w:p>
-    <w:p>
-      <w:pPr>
-        <w:pStyle w:val="ListParagraph"/>
-        <w:numPr>
-          <w:ilvl w:val="3"/>
-          <w:numId w:val="1"/>
-        </w:numPr>
-      </w:pPr>
-      <w:r>
-        <w:t>02c_trimmed_reads_qc</w:t>
-      </w:r>
-      <w:r>
-        <w:t>.sh</w:t>
-      </w:r>
-    </w:p>
-    <w:p>
-      <w:pPr>
-        <w:pStyle w:val="ListParagraph"/>
-        <w:numPr>
-          <w:ilvl w:val="2"/>
-          <w:numId w:val="1"/>
-        </w:numPr>
-      </w:pPr>
-      <w:r>
-        <w:t>03_alignment</w:t>
-      </w:r>
-    </w:p>
-    <w:p>
-      <w:pPr>
-        <w:pStyle w:val="ListParagraph"/>
-        <w:numPr>
-          <w:ilvl w:val="3"/>
-          <w:numId w:val="1"/>
-        </w:numPr>
-      </w:pPr>
-      <w:r>
-        <w:t>03a_download_reference</w:t>
-      </w:r>
-      <w:r>
-        <w:t>.sh</w:t>
-      </w:r>
-    </w:p>
-    <w:p>
-      <w:pPr>
-        <w:pStyle w:val="ListParagraph"/>
-        <w:numPr>
-          <w:ilvl w:val="3"/>
-          <w:numId w:val="1"/>
-        </w:numPr>
-      </w:pPr>
-      <w:r>
-        <w:t>03b_read_alignment</w:t>
-      </w:r>
-      <w:r>
-        <w:t>.sh</w:t>
-      </w:r>
-    </w:p>
-    <w:p>
-      <w:pPr>
-        <w:pStyle w:val="ListParagraph"/>
-        <w:numPr>
-          <w:ilvl w:val="1"/>
-          <w:numId w:val="1"/>
-        </w:numPr>
-      </w:pPr>
-      <w:r>
-        <w:t>results</w:t>
-      </w:r>
-    </w:p>
-    <w:p>
-      <w:pPr>
-        <w:pStyle w:val="ListParagraph"/>
-        <w:numPr>
-          <w:ilvl w:val="2"/>
-          <w:numId w:val="1"/>
-        </w:numPr>
-      </w:pPr>
-      <w:r>
-        <w:t>reports</w:t>
-      </w:r>
-    </w:p>
-    <w:p>
-      <w:pPr>
-        <w:pStyle w:val="ListParagraph"/>
-        <w:numPr>
-          <w:ilvl w:val="2"/>
-          <w:numId w:val="1"/>
-        </w:numPr>
-      </w:pPr>
-      <w:r>
-        <w:t>tables</w:t>
-      </w:r>
-    </w:p>
-    <w:p>
-      <w:pPr>
-        <w:pStyle w:val="ListParagraph"/>
-        <w:numPr>
-          <w:ilvl w:val="2"/>
-          <w:numId w:val="1"/>
-        </w:numPr>
-      </w:pPr>
-      <w:r>
-        <w:t>figures</w:t>
-      </w:r>
-    </w:p>
-    <w:p>
-      <w:pPr>
-        <w:pStyle w:val="ListParagraph"/>
-        <w:numPr>
-          <w:ilvl w:val="2"/>
-          <w:numId w:val="1"/>
-        </w:numPr>
-      </w:pPr>
-      <w:proofErr w:type="spellStart"/>
-      <w:r>
-        <w:t>methods_sections</w:t>
-      </w:r>
-      <w:proofErr w:type="spellEnd"/>
-    </w:p>
-    <w:p>
-      <w:pPr>
-        <w:pStyle w:val="ListParagraph"/>
-        <w:numPr>
-          <w:ilvl w:val="3"/>
-          <w:numId w:val="1"/>
-        </w:numPr>
-      </w:pPr>
-      <w:r>
-        <w:t>02_quality_control</w:t>
-      </w:r>
-    </w:p>
-    <w:p>
-      <w:pPr>
-        <w:pStyle w:val="ListParagraph"/>
-        <w:numPr>
-          <w:ilvl w:val="4"/>
-          <w:numId w:val="1"/>
-        </w:numPr>
-      </w:pPr>
-      <w:r>
-        <w:t>02a_raw_reads_qc</w:t>
-      </w:r>
-    </w:p>
-    <w:p>
-      <w:pPr>
-        <w:pStyle w:val="ListParagraph"/>
-        <w:numPr>
-          <w:ilvl w:val="5"/>
-          <w:numId w:val="1"/>
-        </w:numPr>
-      </w:pPr>
-      <w:proofErr w:type="spellStart"/>
-      <w:r>
-        <w:t>fastqc</w:t>
-      </w:r>
-      <w:proofErr w:type="spellEnd"/>
-    </w:p>
-    <w:p>
-      <w:pPr>
-        <w:pStyle w:val="ListParagraph"/>
-        <w:numPr>
-          <w:ilvl w:val="5"/>
-          <w:numId w:val="1"/>
-        </w:numPr>
-      </w:pPr>
-      <w:proofErr w:type="spellStart"/>
-      <w:r>
-        <w:t>mirtrace</w:t>
-      </w:r>
-      <w:proofErr w:type="spellEnd"/>
-    </w:p>
-    <w:p>
-      <w:pPr>
-        <w:pStyle w:val="ListParagraph"/>
-        <w:numPr>
-          <w:ilvl w:val="6"/>
-          <w:numId w:val="1"/>
-        </w:numPr>
-      </w:pPr>
-      <w:r>
-        <w:t>qc</w:t>
-      </w:r>
-    </w:p>
-    <w:p>
-      <w:pPr>
-        <w:pStyle w:val="ListParagraph"/>
-        <w:numPr>
-          <w:ilvl w:val="6"/>
-          <w:numId w:val="1"/>
-        </w:numPr>
-      </w:pPr>
-      <w:r>
-        <w:t>trace</w:t>
-      </w:r>
-    </w:p>
-    <w:p>
-      <w:pPr>
-        <w:pStyle w:val="ListParagraph"/>
-        <w:numPr>
-          <w:ilvl w:val="4"/>
-          <w:numId w:val="1"/>
-        </w:numPr>
-      </w:pPr>
-      <w:r>
-        <w:t>02b_trimming</w:t>
-      </w:r>
-    </w:p>
-    <w:p>
-      <w:pPr>
-        <w:pStyle w:val="ListParagraph"/>
-        <w:numPr>
-          <w:ilvl w:val="5"/>
-          <w:numId w:val="1"/>
-        </w:numPr>
-      </w:pPr>
-      <w:proofErr w:type="spellStart"/>
-      <w:r>
-        <w:t>cutadapt</w:t>
-      </w:r>
-      <w:proofErr w:type="spellEnd"/>
-    </w:p>
-    <w:p>
-      <w:pPr>
-        <w:pStyle w:val="ListParagraph"/>
-        <w:numPr>
-          <w:ilvl w:val="4"/>
-          <w:numId w:val="1"/>
-        </w:numPr>
-      </w:pPr>
-      <w:r>
-        <w:t>02c_trimmed_reads_qc</w:t>
-      </w:r>
-    </w:p>
-    <w:p>
-      <w:pPr>
-        <w:pStyle w:val="ListParagraph"/>
-        <w:numPr>
-          <w:ilvl w:val="5"/>
-          <w:numId w:val="1"/>
-        </w:numPr>
-      </w:pPr>
-      <w:proofErr w:type="spellStart"/>
-      <w:r>
-        <w:t>fastqc</w:t>
-      </w:r>
-      <w:proofErr w:type="spellEnd"/>
-    </w:p>
-    <w:p>
-      <w:pPr>
-        <w:pStyle w:val="ListParagraph"/>
-        <w:numPr>
-          <w:ilvl w:val="5"/>
-          <w:numId w:val="1"/>
-        </w:numPr>
-      </w:pPr>
-      <w:proofErr w:type="spellStart"/>
-      <w:r>
-        <w:t>mirtrace</w:t>
-      </w:r>
-      <w:proofErr w:type="spellEnd"/>
-    </w:p>
-    <w:p>
-      <w:pPr>
-        <w:pStyle w:val="ListParagraph"/>
-        <w:numPr>
-          <w:ilvl w:val="6"/>
-          <w:numId w:val="1"/>
-        </w:numPr>
-      </w:pPr>
-      <w:r>
-        <w:t>qc</w:t>
-      </w:r>
-    </w:p>
-    <w:p>
-      <w:pPr>
-        <w:pStyle w:val="ListParagraph"/>
-        <w:numPr>
-          <w:ilvl w:val="6"/>
-          <w:numId w:val="1"/>
-        </w:numPr>
-      </w:pPr>
-      <w:r>
-        <w:t>trace</w:t>
-      </w:r>
-    </w:p>
-    <w:p>
-      <w:pPr>
-        <w:pStyle w:val="ListParagraph"/>
-        <w:numPr>
-          <w:ilvl w:val="1"/>
-          <w:numId w:val="1"/>
-        </w:numPr>
-      </w:pPr>
-      <w:r>
-        <w:t>logs</w:t>
-      </w:r>
-    </w:p>
-    <w:p>
-      <w:pPr>
-        <w:pStyle w:val="ListParagraph"/>
-        <w:numPr>
-          <w:ilvl w:val="2"/>
-          <w:numId w:val="1"/>
-        </w:numPr>
-      </w:pPr>
-      <w:r>
-        <w:t>02_quality_control</w:t>
-      </w:r>
-    </w:p>
-    <w:p>
-      <w:pPr>
-        <w:pStyle w:val="ListParagraph"/>
-        <w:numPr>
-          <w:ilvl w:val="3"/>
-          <w:numId w:val="1"/>
-        </w:numPr>
-      </w:pPr>
-      <w:r>
-        <w:t>02a_raw_reads_qc</w:t>
-      </w:r>
-    </w:p>
-    <w:p>
-      <w:pPr>
-        <w:pStyle w:val="ListParagraph"/>
-        <w:numPr>
-          <w:ilvl w:val="3"/>
-          <w:numId w:val="1"/>
-        </w:numPr>
-      </w:pPr>
-      <w:r>
-        <w:t>02b_trimming</w:t>
-      </w:r>
-    </w:p>
-    <w:p>
-      <w:pPr>
-        <w:pStyle w:val="ListParagraph"/>
-        <w:numPr>
-          <w:ilvl w:val="3"/>
-          <w:numId w:val="1"/>
-        </w:numPr>
-      </w:pPr>
-      <w:r>
-        <w:lastRenderedPageBreak/>
+      <w:r>
         <w:t>02c_trimmed_reads_qc</w:t>
       </w:r>
     </w:p>

</xml_diff>

<commit_message>
ADDING TODAY'S WORK - 15.05.2026
</commit_message>
<xml_diff>
--- a/01_Protease/docs/plans/L4137_project_structure.docx
+++ b/01_Protease/docs/plans/L4137_project_structure.docx
@@ -560,6 +560,104 @@
       </w:r>
     </w:p>
     <w:p>
+      <w:pPr>
+        <w:pStyle w:val="ListParagraph"/>
+        <w:numPr>
+          <w:ilvl w:val="0"/>
+          <w:numId w:val="3"/>
+        </w:numPr>
+      </w:pPr>
+      <w:r>
+        <w:t xml:space="preserve">Use </w:t>
+      </w:r>
+      <w:proofErr w:type="spellStart"/>
+      <w:r>
+        <w:t>Nextflow</w:t>
+      </w:r>
+      <w:proofErr w:type="spellEnd"/>
+      <w:r>
+        <w:t xml:space="preserve"> to create pipeline (this is most often used in industrial settings over </w:t>
+      </w:r>
+      <w:proofErr w:type="spellStart"/>
+      <w:r>
+        <w:t>snakemake</w:t>
+      </w:r>
+      <w:proofErr w:type="spellEnd"/>
+      <w:r>
+        <w:t>) – need to parallelise all sample processing (e.g., array) to allow scale-up</w:t>
+      </w:r>
+    </w:p>
+    <w:p>
+      <w:pPr>
+        <w:pStyle w:val="ListParagraph"/>
+        <w:numPr>
+          <w:ilvl w:val="0"/>
+          <w:numId w:val="3"/>
+        </w:numPr>
+      </w:pPr>
+      <w:r>
+        <w:t xml:space="preserve">Have </w:t>
+      </w:r>
+      <w:r>
+        <w:t xml:space="preserve">‘INFILE’ / ‘OUTFILE’ and ‘INDIR’ / ‘OUTDIR’ at the start of all variable names for inputs and outputs as this makes it clear what the command is doing. E.g., </w:t>
+      </w:r>
+      <w:r>
+        <w:drawing>
+          <wp:inline distT="0" distB="0" distL="0" distR="0" wp14:anchorId="3AD1323A" wp14:editId="65F24BF4">
+            <wp:extent cx="1743342" cy="1435483"/>
+            <wp:effectExtent l="0" t="0" r="0" b="0"/>
+            <wp:docPr id="751057487" name="Picture 1"/>
+            <wp:cNvGraphicFramePr>
+              <a:graphicFrameLocks xmlns:a="http://schemas.openxmlformats.org/drawingml/2006/main" noChangeAspect="1"/>
+            </wp:cNvGraphicFramePr>
+            <a:graphic xmlns:a="http://schemas.openxmlformats.org/drawingml/2006/main">
+              <a:graphicData uri="http://schemas.openxmlformats.org/drawingml/2006/picture">
+                <pic:pic xmlns:pic="http://schemas.openxmlformats.org/drawingml/2006/picture">
+                  <pic:nvPicPr>
+                    <pic:cNvPr id="751057487" name=""/>
+                    <pic:cNvPicPr/>
+                  </pic:nvPicPr>
+                  <pic:blipFill rotWithShape="1">
+                    <a:blip r:embed="rId8"/>
+                    <a:srcRect l="3728" t="45046" r="65853" b="20715"/>
+                    <a:stretch>
+                      <a:fillRect/>
+                    </a:stretch>
+                  </pic:blipFill>
+                  <pic:spPr bwMode="auto">
+                    <a:xfrm>
+                      <a:off x="0" y="0"/>
+                      <a:ext cx="1743453" cy="1435574"/>
+                    </a:xfrm>
+                    <a:prstGeom prst="rect">
+                      <a:avLst/>
+                    </a:prstGeom>
+                    <a:ln>
+                      <a:noFill/>
+                    </a:ln>
+                    <a:extLst>
+                      <a:ext uri="{53640926-AAD7-44D8-BBD7-CCE9431645EC}">
+                        <a14:shadowObscured xmlns:a14="http://schemas.microsoft.com/office/drawing/2010/main"/>
+                      </a:ext>
+                    </a:extLst>
+                  </pic:spPr>
+                </pic:pic>
+              </a:graphicData>
+            </a:graphic>
+          </wp:inline>
+        </w:drawing>
+      </w:r>
+      <w:r>
+        <w:t xml:space="preserve">  </w:t>
+      </w:r>
+      <w:r>
+        <w:sym w:font="Wingdings" w:char="F0E0"/>
+      </w:r>
+      <w:r>
+        <w:t xml:space="preserve"> this is quite hard to see what the command does</w:t>
+      </w:r>
+    </w:p>
+    <w:p>
       <w:r>
         <w:rPr>
           <w:b/>
@@ -835,6 +933,7 @@
         </w:numPr>
       </w:pPr>
       <w:r>
+        <w:lastRenderedPageBreak/>
         <w:t>figures</w:t>
       </w:r>
     </w:p>
@@ -988,7 +1087,6 @@
       </w:pPr>
       <w:proofErr w:type="spellStart"/>
       <w:r>
-        <w:lastRenderedPageBreak/>
         <w:t>fastqc</w:t>
       </w:r>
       <w:proofErr w:type="spellEnd"/>

</xml_diff>

<commit_message>
ADDING TODAY'S WORK - 18.05.2026
</commit_message>
<xml_diff>
--- a/01_Protease/docs/plans/L4137_project_structure.docx
+++ b/01_Protease/docs/plans/L4137_project_structure.docx
@@ -602,6 +602,9 @@
         <w:t xml:space="preserve">‘INFILE’ / ‘OUTFILE’ and ‘INDIR’ / ‘OUTDIR’ at the start of all variable names for inputs and outputs as this makes it clear what the command is doing. E.g., </w:t>
       </w:r>
       <w:r>
+        <w:rPr>
+          <w:noProof/>
+        </w:rPr>
         <w:drawing>
           <wp:inline distT="0" distB="0" distL="0" distR="0" wp14:anchorId="3AD1323A" wp14:editId="65F24BF4">
             <wp:extent cx="1743342" cy="1435483"/>
@@ -658,6 +661,34 @@
       </w:r>
     </w:p>
     <w:p>
+      <w:pPr>
+        <w:pStyle w:val="ListParagraph"/>
+        <w:numPr>
+          <w:ilvl w:val="0"/>
+          <w:numId w:val="3"/>
+        </w:numPr>
+      </w:pPr>
+      <w:r>
+        <w:t xml:space="preserve">Alternative software (e.g., bowtie + </w:t>
+      </w:r>
+      <w:proofErr w:type="spellStart"/>
+      <w:r>
+        <w:t>htseq</w:t>
+      </w:r>
+      <w:proofErr w:type="spellEnd"/>
+      <w:r>
+        <w:t>/</w:t>
+      </w:r>
+      <w:proofErr w:type="spellStart"/>
+      <w:r>
+        <w:t>featurecounts</w:t>
+      </w:r>
+      <w:proofErr w:type="spellEnd"/>
+      <w:r>
+        <w:t xml:space="preserve"> for mapping and quantification or DESeq2 for DE analysis) should be tested to say I’ve validated the method/tried different software in the viva.</w:t>
+      </w:r>
+    </w:p>
+    <w:p>
       <w:r>
         <w:rPr>
           <w:b/>
@@ -897,6 +928,7 @@
         </w:numPr>
       </w:pPr>
       <w:r>
+        <w:lastRenderedPageBreak/>
         <w:t>results</w:t>
       </w:r>
     </w:p>
@@ -933,7 +965,6 @@
         </w:numPr>
       </w:pPr>
       <w:r>
-        <w:lastRenderedPageBreak/>
         <w:t>figures</w:t>
       </w:r>
     </w:p>

</xml_diff>

<commit_message>
ADDING TODAY'S WORK - 19.05.2026
</commit_message>
<xml_diff>
--- a/01_Protease/docs/plans/L4137_project_structure.docx
+++ b/01_Protease/docs/plans/L4137_project_structure.docx
@@ -689,6 +689,30 @@
       </w:r>
     </w:p>
     <w:p>
+      <w:pPr>
+        <w:pStyle w:val="ListParagraph"/>
+        <w:numPr>
+          <w:ilvl w:val="0"/>
+          <w:numId w:val="3"/>
+        </w:numPr>
+      </w:pPr>
+      <w:r>
+        <w:t>Use column names when indexing in R instead of integers because this makes it more readable and more robust</w:t>
+      </w:r>
+    </w:p>
+    <w:p>
+      <w:pPr>
+        <w:pStyle w:val="ListParagraph"/>
+        <w:numPr>
+          <w:ilvl w:val="1"/>
+          <w:numId w:val="3"/>
+        </w:numPr>
+      </w:pPr>
+      <w:r>
+        <w:t>R scripts need preamble</w:t>
+      </w:r>
+    </w:p>
+    <w:p>
       <w:r>
         <w:rPr>
           <w:b/>
@@ -886,6 +910,7 @@
         </w:numPr>
       </w:pPr>
       <w:r>
+        <w:lastRenderedPageBreak/>
         <w:t>03_alignment</w:t>
       </w:r>
     </w:p>
@@ -928,7 +953,6 @@
         </w:numPr>
       </w:pPr>
       <w:r>
-        <w:lastRenderedPageBreak/>
         <w:t>results</w:t>
       </w:r>
     </w:p>

</xml_diff>

<commit_message>
ADDING TODAY'S WORK - 20.05.2026
</commit_message>
<xml_diff>
--- a/01_Protease/docs/plans/L4137_project_structure.docx
+++ b/01_Protease/docs/plans/L4137_project_structure.docx
@@ -713,6 +713,48 @@
       </w:r>
     </w:p>
     <w:p>
+      <w:pPr>
+        <w:pStyle w:val="ListParagraph"/>
+        <w:numPr>
+          <w:ilvl w:val="0"/>
+          <w:numId w:val="3"/>
+        </w:numPr>
+      </w:pPr>
+      <w:r>
+        <w:t xml:space="preserve">Look at the default parameters for </w:t>
+      </w:r>
+      <w:r>
+        <w:t xml:space="preserve">commands because this often has thresholds in e.g., </w:t>
+      </w:r>
+      <w:proofErr w:type="spellStart"/>
+      <w:r>
+        <w:t>enrichKEGG</w:t>
+      </w:r>
+      <w:proofErr w:type="spellEnd"/>
+      <w:r>
+        <w:t xml:space="preserve">( </w:t>
+      </w:r>
+      <w:proofErr w:type="spellStart"/>
+      <w:r>
+        <w:t>pvalueCutoff</w:t>
+      </w:r>
+      <w:proofErr w:type="spellEnd"/>
+      <w:r>
+        <w:t xml:space="preserve"> = 0.05</w:t>
+      </w:r>
+      <w:r>
+        <w:t xml:space="preserve">) and quantifier.pl default is 1 mismatch (this value is cited in </w:t>
+      </w:r>
+      <w:proofErr w:type="spellStart"/>
+      <w:r>
+        <w:t>tamiRNA</w:t>
+      </w:r>
+      <w:proofErr w:type="spellEnd"/>
+      <w:r>
+        <w:t xml:space="preserve"> paper).</w:t>
+      </w:r>
+    </w:p>
+    <w:p>
       <w:r>
         <w:rPr>
           <w:b/>
@@ -865,6 +907,7 @@
         </w:numPr>
       </w:pPr>
       <w:r>
+        <w:lastRenderedPageBreak/>
         <w:t>02a_raw_reads_qc</w:t>
       </w:r>
       <w:r>
@@ -910,7 +953,6 @@
         </w:numPr>
       </w:pPr>
       <w:r>
-        <w:lastRenderedPageBreak/>
         <w:t>03_alignment</w:t>
       </w:r>
     </w:p>

</xml_diff>

<commit_message>
ADDING TODAY'S WORK - 23.05.2026
</commit_message>
<xml_diff>
--- a/01_Protease/docs/plans/L4137_project_structure.docx
+++ b/01_Protease/docs/plans/L4137_project_structure.docx
@@ -591,6 +591,46 @@
       <w:pPr>
         <w:pStyle w:val="ListParagraph"/>
         <w:numPr>
+          <w:ilvl w:val="1"/>
+          <w:numId w:val="3"/>
+        </w:numPr>
+      </w:pPr>
+      <w:r>
+        <w:t xml:space="preserve">mind example </w:t>
+      </w:r>
+      <w:proofErr w:type="spellStart"/>
+      <w:r>
+        <w:t>snakemake</w:t>
+      </w:r>
+      <w:proofErr w:type="spellEnd"/>
+      <w:r>
+        <w:t xml:space="preserve"> script: </w:t>
+      </w:r>
+      <w:hyperlink r:id="rId8" w:history="1">
+        <w:r>
+          <w:rPr>
+            <w:rStyle w:val="Hyperlink"/>
+          </w:rPr>
+          <w:t>https://githu</w:t>
+        </w:r>
+        <w:r>
+          <w:rPr>
+            <w:rStyle w:val="Hyperlink"/>
+          </w:rPr>
+          <w:t>b</w:t>
+        </w:r>
+        <w:r>
+          <w:rPr>
+            <w:rStyle w:val="Hyperlink"/>
+          </w:rPr>
+          <w:t>.com/tamirna/miND/blob/main/repository/mirbase/Snakefile</w:t>
+        </w:r>
+      </w:hyperlink>
+    </w:p>
+    <w:p>
+      <w:pPr>
+        <w:pStyle w:val="ListParagraph"/>
+        <w:numPr>
           <w:ilvl w:val="0"/>
           <w:numId w:val="3"/>
         </w:numPr>
@@ -621,7 +661,7 @@
                     <pic:cNvPicPr/>
                   </pic:nvPicPr>
                   <pic:blipFill rotWithShape="1">
-                    <a:blip r:embed="rId8"/>
+                    <a:blip r:embed="rId9"/>
                     <a:srcRect l="3728" t="45046" r="65853" b="20715"/>
                     <a:stretch>
                       <a:fillRect/>
@@ -727,6 +767,7 @@
         <w:t xml:space="preserve">commands because this often has thresholds in e.g., </w:t>
       </w:r>
       <w:proofErr w:type="spellStart"/>
+      <w:proofErr w:type="gramStart"/>
       <w:r>
         <w:t>enrichKEGG</w:t>
       </w:r>
@@ -739,11 +780,9 @@
         <w:t>pvalueCutoff</w:t>
       </w:r>
       <w:proofErr w:type="spellEnd"/>
-      <w:r>
-        <w:t xml:space="preserve"> = 0.05</w:t>
-      </w:r>
-      <w:r>
-        <w:t xml:space="preserve">) and quantifier.pl default is 1 mismatch (this value is cited in </w:t>
+      <w:proofErr w:type="gramEnd"/>
+      <w:r>
+        <w:t xml:space="preserve"> = 0.05) and quantifier.pl default is 1 mismatch (this value is cited in </w:t>
       </w:r>
       <w:proofErr w:type="spellStart"/>
       <w:r>
@@ -752,6 +791,29 @@
       <w:proofErr w:type="spellEnd"/>
       <w:r>
         <w:t xml:space="preserve"> paper).</w:t>
+      </w:r>
+    </w:p>
+    <w:p>
+      <w:pPr>
+        <w:pStyle w:val="ListParagraph"/>
+        <w:numPr>
+          <w:ilvl w:val="0"/>
+          <w:numId w:val="3"/>
+        </w:numPr>
+      </w:pPr>
+      <w:r>
+        <w:t>Specify flags and parameters in the command even if they’re default because this increases readability</w:t>
+      </w:r>
+      <w:r>
+        <w:t xml:space="preserve"> and </w:t>
+      </w:r>
+      <w:proofErr w:type="spellStart"/>
+      <w:r>
+        <w:t>reprodcubility</w:t>
+      </w:r>
+      <w:proofErr w:type="spellEnd"/>
+      <w:r>
+        <w:t>.</w:t>
       </w:r>
     </w:p>
     <w:p>
@@ -847,6 +909,7 @@
         </w:numPr>
       </w:pPr>
       <w:r>
+        <w:lastRenderedPageBreak/>
         <w:t>reference</w:t>
       </w:r>
     </w:p>
@@ -907,451 +970,451 @@
         </w:numPr>
       </w:pPr>
       <w:r>
+        <w:t>02a_raw_reads_qc</w:t>
+      </w:r>
+      <w:r>
+        <w:t>.sh</w:t>
+      </w:r>
+    </w:p>
+    <w:p>
+      <w:pPr>
+        <w:pStyle w:val="ListParagraph"/>
+        <w:numPr>
+          <w:ilvl w:val="3"/>
+          <w:numId w:val="1"/>
+        </w:numPr>
+      </w:pPr>
+      <w:r>
+        <w:t>02b_trimming</w:t>
+      </w:r>
+      <w:r>
+        <w:t>.sh</w:t>
+      </w:r>
+    </w:p>
+    <w:p>
+      <w:pPr>
+        <w:pStyle w:val="ListParagraph"/>
+        <w:numPr>
+          <w:ilvl w:val="3"/>
+          <w:numId w:val="1"/>
+        </w:numPr>
+      </w:pPr>
+      <w:r>
+        <w:t>02c_trimmed_reads_qc</w:t>
+      </w:r>
+      <w:r>
+        <w:t>.sh</w:t>
+      </w:r>
+    </w:p>
+    <w:p>
+      <w:pPr>
+        <w:pStyle w:val="ListParagraph"/>
+        <w:numPr>
+          <w:ilvl w:val="2"/>
+          <w:numId w:val="1"/>
+        </w:numPr>
+      </w:pPr>
+      <w:r>
+        <w:t>03_alignment</w:t>
+      </w:r>
+    </w:p>
+    <w:p>
+      <w:pPr>
+        <w:pStyle w:val="ListParagraph"/>
+        <w:numPr>
+          <w:ilvl w:val="3"/>
+          <w:numId w:val="1"/>
+        </w:numPr>
+      </w:pPr>
+      <w:r>
+        <w:t>03a_download_reference</w:t>
+      </w:r>
+      <w:r>
+        <w:t>.sh</w:t>
+      </w:r>
+    </w:p>
+    <w:p>
+      <w:pPr>
+        <w:pStyle w:val="ListParagraph"/>
+        <w:numPr>
+          <w:ilvl w:val="3"/>
+          <w:numId w:val="1"/>
+        </w:numPr>
+      </w:pPr>
+      <w:r>
+        <w:t>03b_read_alignment</w:t>
+      </w:r>
+      <w:r>
+        <w:t>.sh</w:t>
+      </w:r>
+    </w:p>
+    <w:p>
+      <w:pPr>
+        <w:pStyle w:val="ListParagraph"/>
+        <w:numPr>
+          <w:ilvl w:val="1"/>
+          <w:numId w:val="1"/>
+        </w:numPr>
+      </w:pPr>
+      <w:r>
+        <w:t>results</w:t>
+      </w:r>
+    </w:p>
+    <w:p>
+      <w:pPr>
+        <w:pStyle w:val="ListParagraph"/>
+        <w:numPr>
+          <w:ilvl w:val="2"/>
+          <w:numId w:val="1"/>
+        </w:numPr>
+      </w:pPr>
+      <w:r>
+        <w:t>reports</w:t>
+      </w:r>
+    </w:p>
+    <w:p>
+      <w:pPr>
+        <w:pStyle w:val="ListParagraph"/>
+        <w:numPr>
+          <w:ilvl w:val="2"/>
+          <w:numId w:val="1"/>
+        </w:numPr>
+      </w:pPr>
+      <w:r>
+        <w:t>tables</w:t>
+      </w:r>
+    </w:p>
+    <w:p>
+      <w:pPr>
+        <w:pStyle w:val="ListParagraph"/>
+        <w:numPr>
+          <w:ilvl w:val="2"/>
+          <w:numId w:val="1"/>
+        </w:numPr>
+      </w:pPr>
+      <w:r>
+        <w:t>figures</w:t>
+      </w:r>
+    </w:p>
+    <w:p>
+      <w:pPr>
+        <w:pStyle w:val="ListParagraph"/>
+        <w:numPr>
+          <w:ilvl w:val="2"/>
+          <w:numId w:val="1"/>
+        </w:numPr>
+      </w:pPr>
+      <w:proofErr w:type="spellStart"/>
+      <w:r>
+        <w:t>methods_sections</w:t>
+      </w:r>
+      <w:proofErr w:type="spellEnd"/>
+    </w:p>
+    <w:p>
+      <w:pPr>
+        <w:pStyle w:val="ListParagraph"/>
+        <w:numPr>
+          <w:ilvl w:val="3"/>
+          <w:numId w:val="1"/>
+        </w:numPr>
+      </w:pPr>
+      <w:r>
+        <w:t>01_data_preparation</w:t>
+      </w:r>
+    </w:p>
+    <w:p>
+      <w:pPr>
+        <w:pStyle w:val="ListParagraph"/>
+        <w:numPr>
+          <w:ilvl w:val="3"/>
+          <w:numId w:val="1"/>
+        </w:numPr>
+      </w:pPr>
+      <w:r>
+        <w:t>02_quality_control</w:t>
+      </w:r>
+    </w:p>
+    <w:p>
+      <w:pPr>
+        <w:pStyle w:val="ListParagraph"/>
+        <w:numPr>
+          <w:ilvl w:val="4"/>
+          <w:numId w:val="1"/>
+        </w:numPr>
+      </w:pPr>
+      <w:r>
+        <w:t>02a_raw_reads_qc</w:t>
+      </w:r>
+    </w:p>
+    <w:p>
+      <w:pPr>
+        <w:pStyle w:val="ListParagraph"/>
+        <w:numPr>
+          <w:ilvl w:val="5"/>
+          <w:numId w:val="1"/>
+        </w:numPr>
+      </w:pPr>
+      <w:proofErr w:type="spellStart"/>
+      <w:r>
+        <w:t>fastqc</w:t>
+      </w:r>
+      <w:proofErr w:type="spellEnd"/>
+    </w:p>
+    <w:p>
+      <w:pPr>
+        <w:pStyle w:val="ListParagraph"/>
+        <w:numPr>
+          <w:ilvl w:val="5"/>
+          <w:numId w:val="1"/>
+        </w:numPr>
+      </w:pPr>
+      <w:proofErr w:type="spellStart"/>
+      <w:r>
+        <w:t>mirtrace</w:t>
+      </w:r>
+      <w:proofErr w:type="spellEnd"/>
+    </w:p>
+    <w:p>
+      <w:pPr>
+        <w:pStyle w:val="ListParagraph"/>
+        <w:numPr>
+          <w:ilvl w:val="6"/>
+          <w:numId w:val="1"/>
+        </w:numPr>
+      </w:pPr>
+      <w:r>
+        <w:t>qc</w:t>
+      </w:r>
+    </w:p>
+    <w:p>
+      <w:pPr>
+        <w:pStyle w:val="ListParagraph"/>
+        <w:numPr>
+          <w:ilvl w:val="6"/>
+          <w:numId w:val="1"/>
+        </w:numPr>
+      </w:pPr>
+      <w:r>
+        <w:t>trace</w:t>
+      </w:r>
+    </w:p>
+    <w:p>
+      <w:pPr>
+        <w:pStyle w:val="ListParagraph"/>
+        <w:numPr>
+          <w:ilvl w:val="4"/>
+          <w:numId w:val="1"/>
+        </w:numPr>
+      </w:pPr>
+      <w:r>
+        <w:t>02b_trimming</w:t>
+      </w:r>
+    </w:p>
+    <w:p>
+      <w:pPr>
+        <w:pStyle w:val="ListParagraph"/>
+        <w:numPr>
+          <w:ilvl w:val="5"/>
+          <w:numId w:val="1"/>
+        </w:numPr>
+      </w:pPr>
+      <w:proofErr w:type="spellStart"/>
+      <w:r>
+        <w:t>cutadapt</w:t>
+      </w:r>
+      <w:proofErr w:type="spellEnd"/>
+    </w:p>
+    <w:p>
+      <w:pPr>
+        <w:pStyle w:val="ListParagraph"/>
+        <w:numPr>
+          <w:ilvl w:val="4"/>
+          <w:numId w:val="1"/>
+        </w:numPr>
+      </w:pPr>
+      <w:r>
+        <w:t>02c_trimmed_reads_qc</w:t>
+      </w:r>
+    </w:p>
+    <w:p>
+      <w:pPr>
+        <w:pStyle w:val="ListParagraph"/>
+        <w:numPr>
+          <w:ilvl w:val="5"/>
+          <w:numId w:val="1"/>
+        </w:numPr>
+      </w:pPr>
+      <w:proofErr w:type="spellStart"/>
+      <w:r>
+        <w:t>fastqc</w:t>
+      </w:r>
+      <w:proofErr w:type="spellEnd"/>
+    </w:p>
+    <w:p>
+      <w:pPr>
+        <w:pStyle w:val="ListParagraph"/>
+        <w:numPr>
+          <w:ilvl w:val="5"/>
+          <w:numId w:val="1"/>
+        </w:numPr>
+      </w:pPr>
+      <w:proofErr w:type="spellStart"/>
+      <w:r>
+        <w:t>mirtrace</w:t>
+      </w:r>
+      <w:proofErr w:type="spellEnd"/>
+    </w:p>
+    <w:p>
+      <w:pPr>
+        <w:pStyle w:val="ListParagraph"/>
+        <w:numPr>
+          <w:ilvl w:val="6"/>
+          <w:numId w:val="1"/>
+        </w:numPr>
+      </w:pPr>
+      <w:r>
+        <w:t>qc</w:t>
+      </w:r>
+    </w:p>
+    <w:p>
+      <w:pPr>
+        <w:pStyle w:val="ListParagraph"/>
+        <w:numPr>
+          <w:ilvl w:val="6"/>
+          <w:numId w:val="1"/>
+        </w:numPr>
+      </w:pPr>
+      <w:r>
+        <w:t>trace</w:t>
+      </w:r>
+    </w:p>
+    <w:p>
+      <w:pPr>
+        <w:pStyle w:val="ListParagraph"/>
+        <w:numPr>
+          <w:ilvl w:val="3"/>
+          <w:numId w:val="1"/>
+        </w:numPr>
+      </w:pPr>
+      <w:r>
+        <w:t>03_alignment</w:t>
+      </w:r>
+    </w:p>
+    <w:p>
+      <w:pPr>
+        <w:pStyle w:val="ListParagraph"/>
+        <w:numPr>
+          <w:ilvl w:val="4"/>
+          <w:numId w:val="1"/>
+        </w:numPr>
+      </w:pPr>
+    </w:p>
+    <w:p>
+      <w:pPr>
+        <w:pStyle w:val="ListParagraph"/>
+        <w:numPr>
+          <w:ilvl w:val="1"/>
+          <w:numId w:val="1"/>
+        </w:numPr>
+      </w:pPr>
+      <w:r>
+        <w:t>logs</w:t>
+      </w:r>
+    </w:p>
+    <w:p>
+      <w:pPr>
+        <w:pStyle w:val="ListParagraph"/>
+        <w:numPr>
+          <w:ilvl w:val="2"/>
+          <w:numId w:val="1"/>
+        </w:numPr>
+      </w:pPr>
+      <w:r>
+        <w:t>02_quality_control</w:t>
+      </w:r>
+    </w:p>
+    <w:p>
+      <w:pPr>
+        <w:pStyle w:val="ListParagraph"/>
+        <w:numPr>
+          <w:ilvl w:val="3"/>
+          <w:numId w:val="1"/>
+        </w:numPr>
+      </w:pPr>
+      <w:r>
+        <w:t>02a_raw_reads_qc</w:t>
+      </w:r>
+    </w:p>
+    <w:p>
+      <w:pPr>
+        <w:pStyle w:val="ListParagraph"/>
+        <w:numPr>
+          <w:ilvl w:val="3"/>
+          <w:numId w:val="1"/>
+        </w:numPr>
+      </w:pPr>
+      <w:r>
+        <w:t>02b_trimming</w:t>
+      </w:r>
+    </w:p>
+    <w:p>
+      <w:pPr>
+        <w:pStyle w:val="ListParagraph"/>
+        <w:numPr>
+          <w:ilvl w:val="3"/>
+          <w:numId w:val="1"/>
+        </w:numPr>
+      </w:pPr>
+      <w:r>
+        <w:t>02c_trimmed_reads_qc</w:t>
+      </w:r>
+    </w:p>
+    <w:p>
+      <w:pPr>
+        <w:pStyle w:val="ListParagraph"/>
+        <w:numPr>
+          <w:ilvl w:val="1"/>
+          <w:numId w:val="1"/>
+        </w:numPr>
+      </w:pPr>
+      <w:r>
+        <w:t>investigations</w:t>
+      </w:r>
+    </w:p>
+    <w:p>
+      <w:pPr>
+        <w:pStyle w:val="ListParagraph"/>
+        <w:numPr>
+          <w:ilvl w:val="0"/>
+          <w:numId w:val="1"/>
+        </w:numPr>
+      </w:pPr>
+      <w:r>
+        <w:t>02_HDM_Dog</w:t>
+      </w:r>
+    </w:p>
+    <w:p>
+      <w:pPr>
+        <w:pStyle w:val="ListParagraph"/>
+        <w:numPr>
+          <w:ilvl w:val="1"/>
+          <w:numId w:val="1"/>
+        </w:numPr>
+      </w:pPr>
+      <w:r>
+        <w:t>scripts</w:t>
+      </w:r>
+    </w:p>
+    <w:p>
+      <w:pPr>
+        <w:pStyle w:val="ListParagraph"/>
+        <w:numPr>
+          <w:ilvl w:val="0"/>
+          <w:numId w:val="1"/>
+        </w:numPr>
+      </w:pPr>
+      <w:r>
         <w:lastRenderedPageBreak/>
-        <w:t>02a_raw_reads_qc</w:t>
-      </w:r>
-      <w:r>
-        <w:t>.sh</w:t>
-      </w:r>
-    </w:p>
-    <w:p>
-      <w:pPr>
-        <w:pStyle w:val="ListParagraph"/>
-        <w:numPr>
-          <w:ilvl w:val="3"/>
-          <w:numId w:val="1"/>
-        </w:numPr>
-      </w:pPr>
-      <w:r>
-        <w:t>02b_trimming</w:t>
-      </w:r>
-      <w:r>
-        <w:t>.sh</w:t>
-      </w:r>
-    </w:p>
-    <w:p>
-      <w:pPr>
-        <w:pStyle w:val="ListParagraph"/>
-        <w:numPr>
-          <w:ilvl w:val="3"/>
-          <w:numId w:val="1"/>
-        </w:numPr>
-      </w:pPr>
-      <w:r>
-        <w:t>02c_trimmed_reads_qc</w:t>
-      </w:r>
-      <w:r>
-        <w:t>.sh</w:t>
-      </w:r>
-    </w:p>
-    <w:p>
-      <w:pPr>
-        <w:pStyle w:val="ListParagraph"/>
-        <w:numPr>
-          <w:ilvl w:val="2"/>
-          <w:numId w:val="1"/>
-        </w:numPr>
-      </w:pPr>
-      <w:r>
-        <w:t>03_alignment</w:t>
-      </w:r>
-    </w:p>
-    <w:p>
-      <w:pPr>
-        <w:pStyle w:val="ListParagraph"/>
-        <w:numPr>
-          <w:ilvl w:val="3"/>
-          <w:numId w:val="1"/>
-        </w:numPr>
-      </w:pPr>
-      <w:r>
-        <w:t>03a_download_reference</w:t>
-      </w:r>
-      <w:r>
-        <w:t>.sh</w:t>
-      </w:r>
-    </w:p>
-    <w:p>
-      <w:pPr>
-        <w:pStyle w:val="ListParagraph"/>
-        <w:numPr>
-          <w:ilvl w:val="3"/>
-          <w:numId w:val="1"/>
-        </w:numPr>
-      </w:pPr>
-      <w:r>
-        <w:t>03b_read_alignment</w:t>
-      </w:r>
-      <w:r>
-        <w:t>.sh</w:t>
-      </w:r>
-    </w:p>
-    <w:p>
-      <w:pPr>
-        <w:pStyle w:val="ListParagraph"/>
-        <w:numPr>
-          <w:ilvl w:val="1"/>
-          <w:numId w:val="1"/>
-        </w:numPr>
-      </w:pPr>
-      <w:r>
-        <w:t>results</w:t>
-      </w:r>
-    </w:p>
-    <w:p>
-      <w:pPr>
-        <w:pStyle w:val="ListParagraph"/>
-        <w:numPr>
-          <w:ilvl w:val="2"/>
-          <w:numId w:val="1"/>
-        </w:numPr>
-      </w:pPr>
-      <w:r>
-        <w:t>reports</w:t>
-      </w:r>
-    </w:p>
-    <w:p>
-      <w:pPr>
-        <w:pStyle w:val="ListParagraph"/>
-        <w:numPr>
-          <w:ilvl w:val="2"/>
-          <w:numId w:val="1"/>
-        </w:numPr>
-      </w:pPr>
-      <w:r>
-        <w:t>tables</w:t>
-      </w:r>
-    </w:p>
-    <w:p>
-      <w:pPr>
-        <w:pStyle w:val="ListParagraph"/>
-        <w:numPr>
-          <w:ilvl w:val="2"/>
-          <w:numId w:val="1"/>
-        </w:numPr>
-      </w:pPr>
-      <w:r>
-        <w:t>figures</w:t>
-      </w:r>
-    </w:p>
-    <w:p>
-      <w:pPr>
-        <w:pStyle w:val="ListParagraph"/>
-        <w:numPr>
-          <w:ilvl w:val="2"/>
-          <w:numId w:val="1"/>
-        </w:numPr>
-      </w:pPr>
-      <w:proofErr w:type="spellStart"/>
-      <w:r>
-        <w:t>methods_sections</w:t>
-      </w:r>
-      <w:proofErr w:type="spellEnd"/>
-    </w:p>
-    <w:p>
-      <w:pPr>
-        <w:pStyle w:val="ListParagraph"/>
-        <w:numPr>
-          <w:ilvl w:val="3"/>
-          <w:numId w:val="1"/>
-        </w:numPr>
-      </w:pPr>
-      <w:r>
-        <w:t>01_data_preparation</w:t>
-      </w:r>
-    </w:p>
-    <w:p>
-      <w:pPr>
-        <w:pStyle w:val="ListParagraph"/>
-        <w:numPr>
-          <w:ilvl w:val="3"/>
-          <w:numId w:val="1"/>
-        </w:numPr>
-      </w:pPr>
-      <w:r>
-        <w:t>02_quality_control</w:t>
-      </w:r>
-    </w:p>
-    <w:p>
-      <w:pPr>
-        <w:pStyle w:val="ListParagraph"/>
-        <w:numPr>
-          <w:ilvl w:val="4"/>
-          <w:numId w:val="1"/>
-        </w:numPr>
-      </w:pPr>
-      <w:r>
-        <w:t>02a_raw_reads_qc</w:t>
-      </w:r>
-    </w:p>
-    <w:p>
-      <w:pPr>
-        <w:pStyle w:val="ListParagraph"/>
-        <w:numPr>
-          <w:ilvl w:val="5"/>
-          <w:numId w:val="1"/>
-        </w:numPr>
-      </w:pPr>
-      <w:proofErr w:type="spellStart"/>
-      <w:r>
-        <w:t>fastqc</w:t>
-      </w:r>
-      <w:proofErr w:type="spellEnd"/>
-    </w:p>
-    <w:p>
-      <w:pPr>
-        <w:pStyle w:val="ListParagraph"/>
-        <w:numPr>
-          <w:ilvl w:val="5"/>
-          <w:numId w:val="1"/>
-        </w:numPr>
-      </w:pPr>
-      <w:proofErr w:type="spellStart"/>
-      <w:r>
-        <w:t>mirtrace</w:t>
-      </w:r>
-      <w:proofErr w:type="spellEnd"/>
-    </w:p>
-    <w:p>
-      <w:pPr>
-        <w:pStyle w:val="ListParagraph"/>
-        <w:numPr>
-          <w:ilvl w:val="6"/>
-          <w:numId w:val="1"/>
-        </w:numPr>
-      </w:pPr>
-      <w:r>
-        <w:t>qc</w:t>
-      </w:r>
-    </w:p>
-    <w:p>
-      <w:pPr>
-        <w:pStyle w:val="ListParagraph"/>
-        <w:numPr>
-          <w:ilvl w:val="6"/>
-          <w:numId w:val="1"/>
-        </w:numPr>
-      </w:pPr>
-      <w:r>
-        <w:t>trace</w:t>
-      </w:r>
-    </w:p>
-    <w:p>
-      <w:pPr>
-        <w:pStyle w:val="ListParagraph"/>
-        <w:numPr>
-          <w:ilvl w:val="4"/>
-          <w:numId w:val="1"/>
-        </w:numPr>
-      </w:pPr>
-      <w:r>
-        <w:t>02b_trimming</w:t>
-      </w:r>
-    </w:p>
-    <w:p>
-      <w:pPr>
-        <w:pStyle w:val="ListParagraph"/>
-        <w:numPr>
-          <w:ilvl w:val="5"/>
-          <w:numId w:val="1"/>
-        </w:numPr>
-      </w:pPr>
-      <w:proofErr w:type="spellStart"/>
-      <w:r>
-        <w:t>cutadapt</w:t>
-      </w:r>
-      <w:proofErr w:type="spellEnd"/>
-    </w:p>
-    <w:p>
-      <w:pPr>
-        <w:pStyle w:val="ListParagraph"/>
-        <w:numPr>
-          <w:ilvl w:val="4"/>
-          <w:numId w:val="1"/>
-        </w:numPr>
-      </w:pPr>
-      <w:r>
-        <w:t>02c_trimmed_reads_qc</w:t>
-      </w:r>
-    </w:p>
-    <w:p>
-      <w:pPr>
-        <w:pStyle w:val="ListParagraph"/>
-        <w:numPr>
-          <w:ilvl w:val="5"/>
-          <w:numId w:val="1"/>
-        </w:numPr>
-      </w:pPr>
-      <w:proofErr w:type="spellStart"/>
-      <w:r>
-        <w:t>fastqc</w:t>
-      </w:r>
-      <w:proofErr w:type="spellEnd"/>
-    </w:p>
-    <w:p>
-      <w:pPr>
-        <w:pStyle w:val="ListParagraph"/>
-        <w:numPr>
-          <w:ilvl w:val="5"/>
-          <w:numId w:val="1"/>
-        </w:numPr>
-      </w:pPr>
-      <w:proofErr w:type="spellStart"/>
-      <w:r>
-        <w:t>mirtrace</w:t>
-      </w:r>
-      <w:proofErr w:type="spellEnd"/>
-    </w:p>
-    <w:p>
-      <w:pPr>
-        <w:pStyle w:val="ListParagraph"/>
-        <w:numPr>
-          <w:ilvl w:val="6"/>
-          <w:numId w:val="1"/>
-        </w:numPr>
-      </w:pPr>
-      <w:r>
-        <w:t>qc</w:t>
-      </w:r>
-    </w:p>
-    <w:p>
-      <w:pPr>
-        <w:pStyle w:val="ListParagraph"/>
-        <w:numPr>
-          <w:ilvl w:val="6"/>
-          <w:numId w:val="1"/>
-        </w:numPr>
-      </w:pPr>
-      <w:r>
-        <w:t>trace</w:t>
-      </w:r>
-    </w:p>
-    <w:p>
-      <w:pPr>
-        <w:pStyle w:val="ListParagraph"/>
-        <w:numPr>
-          <w:ilvl w:val="3"/>
-          <w:numId w:val="1"/>
-        </w:numPr>
-      </w:pPr>
-      <w:r>
-        <w:t>03_alignment</w:t>
-      </w:r>
-    </w:p>
-    <w:p>
-      <w:pPr>
-        <w:pStyle w:val="ListParagraph"/>
-        <w:numPr>
-          <w:ilvl w:val="4"/>
-          <w:numId w:val="1"/>
-        </w:numPr>
-      </w:pPr>
-    </w:p>
-    <w:p>
-      <w:pPr>
-        <w:pStyle w:val="ListParagraph"/>
-        <w:numPr>
-          <w:ilvl w:val="1"/>
-          <w:numId w:val="1"/>
-        </w:numPr>
-      </w:pPr>
-      <w:r>
-        <w:t>logs</w:t>
-      </w:r>
-    </w:p>
-    <w:p>
-      <w:pPr>
-        <w:pStyle w:val="ListParagraph"/>
-        <w:numPr>
-          <w:ilvl w:val="2"/>
-          <w:numId w:val="1"/>
-        </w:numPr>
-      </w:pPr>
-      <w:r>
-        <w:t>02_quality_control</w:t>
-      </w:r>
-    </w:p>
-    <w:p>
-      <w:pPr>
-        <w:pStyle w:val="ListParagraph"/>
-        <w:numPr>
-          <w:ilvl w:val="3"/>
-          <w:numId w:val="1"/>
-        </w:numPr>
-      </w:pPr>
-      <w:r>
-        <w:t>02a_raw_reads_qc</w:t>
-      </w:r>
-    </w:p>
-    <w:p>
-      <w:pPr>
-        <w:pStyle w:val="ListParagraph"/>
-        <w:numPr>
-          <w:ilvl w:val="3"/>
-          <w:numId w:val="1"/>
-        </w:numPr>
-      </w:pPr>
-      <w:r>
-        <w:t>02b_trimming</w:t>
-      </w:r>
-    </w:p>
-    <w:p>
-      <w:pPr>
-        <w:pStyle w:val="ListParagraph"/>
-        <w:numPr>
-          <w:ilvl w:val="3"/>
-          <w:numId w:val="1"/>
-        </w:numPr>
-      </w:pPr>
-      <w:r>
-        <w:t>02c_trimmed_reads_qc</w:t>
-      </w:r>
-    </w:p>
-    <w:p>
-      <w:pPr>
-        <w:pStyle w:val="ListParagraph"/>
-        <w:numPr>
-          <w:ilvl w:val="1"/>
-          <w:numId w:val="1"/>
-        </w:numPr>
-      </w:pPr>
-      <w:r>
-        <w:t>investigations</w:t>
-      </w:r>
-    </w:p>
-    <w:p>
-      <w:pPr>
-        <w:pStyle w:val="ListParagraph"/>
-        <w:numPr>
-          <w:ilvl w:val="0"/>
-          <w:numId w:val="1"/>
-        </w:numPr>
-      </w:pPr>
-      <w:r>
-        <w:t>02_HDM_Dog</w:t>
-      </w:r>
-    </w:p>
-    <w:p>
-      <w:pPr>
-        <w:pStyle w:val="ListParagraph"/>
-        <w:numPr>
-          <w:ilvl w:val="1"/>
-          <w:numId w:val="1"/>
-        </w:numPr>
-      </w:pPr>
-      <w:r>
-        <w:t>scripts</w:t>
-      </w:r>
-    </w:p>
-    <w:p>
-      <w:pPr>
-        <w:pStyle w:val="ListParagraph"/>
-        <w:numPr>
-          <w:ilvl w:val="0"/>
-          <w:numId w:val="1"/>
-        </w:numPr>
-      </w:pPr>
-      <w:r>
         <w:t>Installation.md</w:t>
       </w:r>
     </w:p>
@@ -2777,6 +2840,18 @@
       <w:shd w:val="clear" w:color="auto" w:fill="E1DFDD"/>
     </w:rPr>
   </w:style>
+  <w:style w:type="character" w:styleId="FollowedHyperlink">
+    <w:name w:val="FollowedHyperlink"/>
+    <w:basedOn w:val="DefaultParagraphFont"/>
+    <w:uiPriority w:val="99"/>
+    <w:semiHidden/>
+    <w:unhideWhenUsed/>
+    <w:rsid w:val="00605314"/>
+    <w:rPr>
+      <w:color w:val="96607D" w:themeColor="followedHyperlink"/>
+      <w:u w:val="single"/>
+    </w:rPr>
+  </w:style>
 </w:styles>
 </file>
 

</xml_diff>